<commit_message>
Improve storage plans and page loading
</commit_message>
<xml_diff>
--- a/docs/Life_Pilot_使用者操作說明.docx
+++ b/docs/Life_Pilot_使用者操作說明.docx
@@ -4,43 +4,48 @@
   <w:body>
     <w:p>
       <w:pPr>
-        <w:pStyle w:val="Title"/>
-        <w:jc w:val="left"/>
+        <w:jc w:val="center"/>
       </w:pPr>
       <w:r>
         <w:rPr>
-          <w:rFonts w:ascii="Aptos" w:hAnsi="Aptos" w:eastAsia="Microsoft JhengHei"/>
+          <w:b/>
+          <w:color w:val="17324D"/>
+          <w:sz w:val="56"/>
         </w:rPr>
         <w:t>Life Pilot 使用者操作說明</w:t>
       </w:r>
     </w:p>
     <w:p>
       <w:pPr>
-        <w:spacing w:after="280"/>
+        <w:jc w:val="center"/>
       </w:pPr>
       <w:r>
         <w:rPr>
-          <w:rFonts w:ascii="Aptos" w:hAnsi="Aptos" w:eastAsia="Microsoft JhengHei"/>
-          <w:color w:val="595959"/>
-          <w:sz w:val="20"/>
+          <w:color w:val="465564"/>
+          <w:sz w:val="26"/>
         </w:rPr>
-        <w:t>Life Pilot 專案文件</w:t>
+        <w:t>逐畫面操作、資料保存、額度與常見問題完整手冊</w:t>
+      </w:r>
+    </w:p>
+    <w:p>
+      <w:pPr>
+        <w:jc w:val="center"/>
+      </w:pPr>
+      <w:r>
+        <w:rPr>
+          <w:sz w:val="21"/>
+        </w:rPr>
+        <w:t>文件版本：2026-09-08</w:t>
+        <w:br/>
+        <w:t>適用：Web、Android、iOS（依實際發布版本）</w:t>
       </w:r>
     </w:p>
     <w:p>
       <w:r>
         <w:rPr>
-          <w:rFonts w:ascii="Aptos" w:hAnsi="Aptos" w:eastAsia="Microsoft JhengHei"/>
+          <w:sz w:val="21"/>
         </w:rPr>
-        <w:t>文件版本：2026-09-08</w:t>
-      </w:r>
-    </w:p>
-    <w:p>
-      <w:r>
-        <w:rPr>
-          <w:rFonts w:ascii="Aptos" w:hAnsi="Aptos" w:eastAsia="Microsoft JhengHei"/>
-        </w:rPr>
-        <w:t>適用平台：Web、Android、iOS、桌面版（實際提供平台以發行版本為準）</w:t>
+        <w:br w:type="page"/>
       </w:r>
     </w:p>
     <w:p>
@@ -49,141 +54,367 @@
       </w:pPr>
       <w:r>
         <w:rPr>
-          <w:rFonts w:ascii="Aptos" w:hAnsi="Aptos" w:eastAsia="Microsoft JhengHei"/>
+          <w:sz w:val="21"/>
         </w:rPr>
-        <w:t>1. Life Pilot 可以做什麼</w:t>
+        <w:t>如何使用本手冊</w:t>
       </w:r>
     </w:p>
     <w:p>
       <w:r>
         <w:rPr>
-          <w:rFonts w:ascii="Aptos" w:hAnsi="Aptos" w:eastAsia="Microsoft JhengHei"/>
+          <w:sz w:val="21"/>
         </w:rPr>
-        <w:t>Life Pilot 是整合生活規劃、行事曆、記帳、積分、回憶、活動景點推薦及學習遊戲的個人管理工具。登入後可依帳號保存資料，並選擇使用雲端模式或此裝置模式。</w:t>
+        <w:t>本手冊適合第一次使用及日常查詢。每個功能均依「進入位置 → 操作步驟 → 成功結果 → 注意事項」說明。畫面文字可能因語系或版本略有不同，但流程一致。</w:t>
+      </w:r>
+    </w:p>
+    <w:tbl>
+      <w:tblPr>
+        <w:tblStyle w:val="TableGrid"/>
+        <w:tblW w:type="auto" w:w="0"/>
+        <w:jc w:val="center"/>
+        <w:tblLook w:firstColumn="1" w:firstRow="1" w:lastColumn="0" w:lastRow="0" w:noHBand="0" w:noVBand="1" w:val="04A0"/>
+      </w:tblPr>
+      <w:tblGrid>
+        <w:gridCol w:w="4986"/>
+        <w:gridCol w:w="4986"/>
+      </w:tblGrid>
+      <w:tr>
+        <w:tc>
+          <w:tcPr>
+            <w:tcW w:type="dxa" w:w="4986"/>
+            <w:shd w:fill="DDEBF2"/>
+          </w:tcPr>
+          <w:p>
+            <w:r>
+              <w:rPr>
+                <w:b/>
+              </w:rPr>
+              <w:t>符號</w:t>
+            </w:r>
+          </w:p>
+        </w:tc>
+        <w:tc>
+          <w:tcPr>
+            <w:tcW w:type="dxa" w:w="4986"/>
+            <w:shd w:fill="DDEBF2"/>
+          </w:tcPr>
+          <w:p>
+            <w:r>
+              <w:rPr>
+                <w:b/>
+              </w:rPr>
+              <w:t>意思</w:t>
+            </w:r>
+          </w:p>
+        </w:tc>
+      </w:tr>
+      <w:tr>
+        <w:tc>
+          <w:tcPr>
+            <w:tcW w:type="dxa" w:w="4986"/>
+            <w:vAlign w:val="top"/>
+          </w:tcPr>
+          <w:p>
+            <w:r>
+              <w:t>雲端</w:t>
+            </w:r>
+          </w:p>
+        </w:tc>
+        <w:tc>
+          <w:tcPr>
+            <w:tcW w:type="dxa" w:w="4986"/>
+            <w:vAlign w:val="top"/>
+          </w:tcPr>
+          <w:p>
+            <w:r>
+              <w:t>資料存於帳號，可在其他裝置登入後使用</w:t>
+            </w:r>
+          </w:p>
+        </w:tc>
+      </w:tr>
+      <w:tr>
+        <w:tc>
+          <w:tcPr>
+            <w:tcW w:type="dxa" w:w="4986"/>
+            <w:vAlign w:val="top"/>
+          </w:tcPr>
+          <w:p>
+            <w:r>
+              <w:t>此裝置</w:t>
+            </w:r>
+          </w:p>
+        </w:tc>
+        <w:tc>
+          <w:tcPr>
+            <w:tcW w:type="dxa" w:w="4986"/>
+            <w:vAlign w:val="top"/>
+          </w:tcPr>
+          <w:p>
+            <w:r>
+              <w:t>資料只存於目前手機、平板、電腦或瀏覽器</w:t>
+            </w:r>
+          </w:p>
+        </w:tc>
+      </w:tr>
+      <w:tr>
+        <w:tc>
+          <w:tcPr>
+            <w:tcW w:type="dxa" w:w="4986"/>
+            <w:vAlign w:val="top"/>
+          </w:tcPr>
+          <w:p>
+            <w:r>
+              <w:t>管理者</w:t>
+            </w:r>
+          </w:p>
+        </w:tc>
+        <w:tc>
+          <w:tcPr>
+            <w:tcW w:type="dxa" w:w="4986"/>
+            <w:vAlign w:val="top"/>
+          </w:tcPr>
+          <w:p>
+            <w:r>
+              <w:t>只有具管理者權限的帳號可見</w:t>
+            </w:r>
+          </w:p>
+        </w:tc>
+      </w:tr>
+      <w:tr>
+        <w:tc>
+          <w:tcPr>
+            <w:tcW w:type="dxa" w:w="4986"/>
+            <w:vAlign w:val="top"/>
+          </w:tcPr>
+          <w:p>
+            <w:r>
+              <w:t>保留項</w:t>
+            </w:r>
+          </w:p>
+        </w:tc>
+        <w:tc>
+          <w:tcPr>
+            <w:tcW w:type="dxa" w:w="4986"/>
+            <w:vAlign w:val="top"/>
+          </w:tcPr>
+          <w:p>
+            <w:r>
+              <w:t>不受近 30 天篩選影響，會持續顯示的記帳／積分紀錄</w:t>
+            </w:r>
+          </w:p>
+        </w:tc>
+      </w:tr>
+    </w:tbl>
+    <w:p/>
+    <w:p>
+      <w:pPr>
+        <w:pStyle w:val="Heading1"/>
+      </w:pPr>
+      <w:r>
+        <w:rPr>
+          <w:sz w:val="21"/>
+        </w:rPr>
+        <w:t>1. 帳號、登入與密碼</w:t>
+      </w:r>
+    </w:p>
+    <w:p>
+      <w:pPr>
+        <w:pStyle w:val="Heading2"/>
+      </w:pPr>
+      <w:r>
+        <w:rPr>
+          <w:sz w:val="21"/>
+        </w:rPr>
+        <w:t>1.1 註冊</w:t>
+      </w:r>
+    </w:p>
+    <w:p>
+      <w:pPr>
+        <w:pStyle w:val="ListNumber"/>
+      </w:pPr>
+      <w:r>
+        <w:rPr>
+          <w:sz w:val="21"/>
+        </w:rPr>
+        <w:t>在登入頁選擇「註冊」。</w:t>
+      </w:r>
+    </w:p>
+    <w:p>
+      <w:pPr>
+        <w:pStyle w:val="ListNumber"/>
+      </w:pPr>
+      <w:r>
+        <w:rPr>
+          <w:sz w:val="21"/>
+        </w:rPr>
+        <w:t>輸入可收信的 Email 與符合畫面規則的密碼。</w:t>
+      </w:r>
+    </w:p>
+    <w:p>
+      <w:pPr>
+        <w:pStyle w:val="ListNumber"/>
+      </w:pPr>
+      <w:r>
+        <w:rPr>
+          <w:sz w:val="21"/>
+        </w:rPr>
+        <w:t>閱讀服務條款與隱私政策，勾選同意後送出。</w:t>
+      </w:r>
+    </w:p>
+    <w:p>
+      <w:pPr>
+        <w:pStyle w:val="ListNumber"/>
+      </w:pPr>
+      <w:r>
+        <w:rPr>
+          <w:sz w:val="21"/>
+        </w:rPr>
+        <w:t>依 Email 驗證信完成驗證，再回到 App 登入。</w:t>
+      </w:r>
+    </w:p>
+    <w:p>
+      <w:pPr>
+        <w:pStyle w:val="ListNumber"/>
+      </w:pPr>
+      <w:r>
+        <w:rPr>
+          <w:sz w:val="21"/>
+        </w:rPr>
+        <w:t>首次登入若未做過選擇，預設使用雲端；資料儲存位置只能在登入後調整。</w:t>
+      </w:r>
+    </w:p>
+    <w:tbl>
+      <w:tblPr>
+        <w:tblW w:type="auto" w:w="0"/>
+        <w:jc w:val="center"/>
+        <w:tblLook w:firstColumn="1" w:firstRow="1" w:lastColumn="0" w:lastRow="0" w:noHBand="0" w:noVBand="1" w:val="04A0"/>
+      </w:tblPr>
+      <w:tblGrid>
+        <w:gridCol w:w="9972"/>
+      </w:tblGrid>
+      <w:tr>
+        <w:tc>
+          <w:tcPr>
+            <w:tcW w:type="dxa" w:w="9972"/>
+            <w:shd w:fill="E8F3F6"/>
+          </w:tcPr>
+          <w:p>
+            <w:r>
+              <w:rPr>
+                <w:b/>
+              </w:rPr>
+              <w:t>成功判斷：</w:t>
+            </w:r>
+            <w:r>
+              <w:t>登入後看到首頁與自己的 Email；不應看到其他帳號的私人資料。</w:t>
+            </w:r>
+          </w:p>
+        </w:tc>
+      </w:tr>
+    </w:tbl>
+    <w:p/>
+    <w:p>
+      <w:pPr>
+        <w:pStyle w:val="Heading2"/>
+      </w:pPr>
+      <w:r>
+        <w:rPr>
+          <w:sz w:val="21"/>
+        </w:rPr>
+        <w:t>1.2 忘記密碼</w:t>
+      </w:r>
+    </w:p>
+    <w:p>
+      <w:pPr>
+        <w:pStyle w:val="ListNumber"/>
+      </w:pPr>
+      <w:r>
+        <w:rPr>
+          <w:sz w:val="21"/>
+        </w:rPr>
+        <w:t>在登入頁點「忘記密碼」。</w:t>
+      </w:r>
+    </w:p>
+    <w:p>
+      <w:pPr>
+        <w:pStyle w:val="ListNumber"/>
+      </w:pPr>
+      <w:r>
+        <w:rPr>
+          <w:sz w:val="21"/>
+        </w:rPr>
+        <w:t>輸入註冊 Email 並送出。</w:t>
+      </w:r>
+    </w:p>
+    <w:p>
+      <w:pPr>
+        <w:pStyle w:val="ListNumber"/>
+      </w:pPr>
+      <w:r>
+        <w:rPr>
+          <w:sz w:val="21"/>
+        </w:rPr>
+        <w:t>開啟最新一封重設信，點連結回到 Life Pilot 的重設密碼頁。</w:t>
+      </w:r>
+    </w:p>
+    <w:p>
+      <w:pPr>
+        <w:pStyle w:val="ListNumber"/>
+      </w:pPr>
+      <w:r>
+        <w:rPr>
+          <w:sz w:val="21"/>
+        </w:rPr>
+        <w:t>設定新密碼後重新登入。</w:t>
+      </w:r>
+    </w:p>
+    <w:tbl>
+      <w:tblPr>
+        <w:tblW w:type="auto" w:w="0"/>
+        <w:jc w:val="center"/>
+        <w:tblLook w:firstColumn="1" w:firstRow="1" w:lastColumn="0" w:lastRow="0" w:noHBand="0" w:noVBand="1" w:val="04A0"/>
+      </w:tblPr>
+      <w:tblGrid>
+        <w:gridCol w:w="9972"/>
+      </w:tblGrid>
+      <w:tr>
+        <w:tc>
+          <w:tcPr>
+            <w:tcW w:type="dxa" w:w="9972"/>
+            <w:shd w:fill="FFF2CC"/>
+          </w:tcPr>
+          <w:p>
+            <w:r>
+              <w:rPr>
+                <w:b/>
+              </w:rPr>
+              <w:t>連結未開啟 App：</w:t>
+            </w:r>
+            <w:r>
+              <w:t>先確認使用最新一封信、連結未過期且 App 已更新；Web 可在同一瀏覽器開啟。若仍停在登入頁，重新寄送一次。</w:t>
+            </w:r>
+          </w:p>
+        </w:tc>
+      </w:tr>
+    </w:tbl>
+    <w:p/>
+    <w:p>
+      <w:pPr>
+        <w:pStyle w:val="Heading2"/>
+      </w:pPr>
+      <w:r>
+        <w:rPr>
+          <w:sz w:val="21"/>
+        </w:rPr>
+        <w:t>1.3 多分頁登出</w:t>
       </w:r>
     </w:p>
     <w:p>
       <w:r>
         <w:rPr>
-          <w:rFonts w:ascii="Aptos" w:hAnsi="Aptos" w:eastAsia="Microsoft JhengHei"/>
+          <w:sz w:val="21"/>
         </w:rPr>
-        <w:t>主要功能：</w:t>
-      </w:r>
-    </w:p>
-    <w:p>
-      <w:pPr>
-        <w:pStyle w:val="ListBullet"/>
-        <w:spacing w:after="60"/>
-      </w:pPr>
-      <w:r>
-        <w:rPr>
-          <w:rFonts w:ascii="Aptos" w:hAnsi="Aptos" w:eastAsia="Microsoft JhengHei"/>
-        </w:rPr>
-        <w:t>首頁：查看近期行程、今日與總金額、今日與總積分、推薦活動及推薦景點。</w:t>
-      </w:r>
-    </w:p>
-    <w:p>
-      <w:pPr>
-        <w:pStyle w:val="ListBullet"/>
-        <w:spacing w:after="60"/>
-      </w:pPr>
-      <w:r>
-        <w:rPr>
-          <w:rFonts w:ascii="Aptos" w:hAnsi="Aptos" w:eastAsia="Microsoft JhengHei"/>
-        </w:rPr>
-        <w:t>行事曆：建立行程、提醒、重複事件及分享指定事件。</w:t>
-      </w:r>
-    </w:p>
-    <w:p>
-      <w:pPr>
-        <w:pStyle w:val="ListBullet"/>
-        <w:spacing w:after="60"/>
-      </w:pPr>
-      <w:r>
-        <w:rPr>
-          <w:rFonts w:ascii="Aptos" w:hAnsi="Aptos" w:eastAsia="Microsoft JhengHei"/>
-        </w:rPr>
-        <w:t>記帳：建立帳戶與明細，記錄日期、金額、幣別、一級分類及二級分類。</w:t>
-      </w:r>
-    </w:p>
-    <w:p>
-      <w:pPr>
-        <w:pStyle w:val="ListBullet"/>
-        <w:spacing w:after="60"/>
-      </w:pPr>
-      <w:r>
-        <w:rPr>
-          <w:rFonts w:ascii="Aptos" w:hAnsi="Aptos" w:eastAsia="Microsoft JhengHei"/>
-        </w:rPr>
-        <w:t>積分：建立個人或團體積分帳戶與明細。</w:t>
-      </w:r>
-    </w:p>
-    <w:p>
-      <w:pPr>
-        <w:pStyle w:val="ListBullet"/>
-        <w:spacing w:after="60"/>
-      </w:pPr>
-      <w:r>
-        <w:rPr>
-          <w:rFonts w:ascii="Aptos" w:hAnsi="Aptos" w:eastAsia="Microsoft JhengHei"/>
-        </w:rPr>
-        <w:t>推薦活動／景點：依城市、關鍵字及清單／地圖模式瀏覽。</w:t>
-      </w:r>
-    </w:p>
-    <w:p>
-      <w:pPr>
-        <w:pStyle w:val="ListBullet"/>
-        <w:spacing w:after="60"/>
-      </w:pPr>
-      <w:r>
-        <w:rPr>
-          <w:rFonts w:ascii="Aptos" w:hAnsi="Aptos" w:eastAsia="Microsoft JhengHei"/>
-        </w:rPr>
-        <w:t>回憶走廊：保存文字、地點、日期及照片，並依時間向前載入。</w:t>
-      </w:r>
-    </w:p>
-    <w:p>
-      <w:pPr>
-        <w:pStyle w:val="ListBullet"/>
-        <w:spacing w:after="60"/>
-      </w:pPr>
-      <w:r>
-        <w:rPr>
-          <w:rFonts w:ascii="Aptos" w:hAnsi="Aptos" w:eastAsia="Microsoft JhengHei"/>
-        </w:rPr>
-        <w:t>遊戲：使用管理者題庫或自建題庫進行學習及益智遊戲。</w:t>
-      </w:r>
-    </w:p>
-    <w:p>
-      <w:pPr>
-        <w:pStyle w:val="ListBullet"/>
-        <w:spacing w:after="60"/>
-      </w:pPr>
-      <w:r>
-        <w:rPr>
-          <w:rFonts w:ascii="Aptos" w:hAnsi="Aptos" w:eastAsia="Microsoft JhengHei"/>
-        </w:rPr>
-        <w:t>行事曆分享：邀請其他帳號唯讀查看全部或指定事件。</w:t>
-      </w:r>
-    </w:p>
-    <w:p>
-      <w:pPr>
-        <w:pStyle w:val="ListBullet"/>
-        <w:spacing w:after="60"/>
-      </w:pPr>
-      <w:r>
-        <w:rPr>
-          <w:rFonts w:ascii="Aptos" w:hAnsi="Aptos" w:eastAsia="Microsoft JhengHei"/>
-        </w:rPr>
-        <w:t>意見回饋：提交問題及查看處理狀態。</w:t>
-      </w:r>
-    </w:p>
-    <w:p>
-      <w:r>
-        <w:rPr>
-          <w:rFonts w:ascii="Aptos" w:hAnsi="Aptos" w:eastAsia="Microsoft JhengHei"/>
-        </w:rPr>
-        <w:t>股票與 Business Plan 目前僅提供管理者使用。</w:t>
+        <w:t>同一瀏覽器開啟多個 Life Pilot 分頁時，其中一頁登出後，其他分頁應自動返回登入狀態；若尚有未送出的表單，請先保存。</w:t>
       </w:r>
     </w:p>
     <w:p>
@@ -192,9 +423,9 @@
       </w:pPr>
       <w:r>
         <w:rPr>
-          <w:rFonts w:ascii="Aptos" w:hAnsi="Aptos" w:eastAsia="Microsoft JhengHei"/>
+          <w:sz w:val="21"/>
         </w:rPr>
-        <w:t>2. 註冊、登入與重設密碼</w:t>
+        <w:t>2. 資料儲存位置與搬移</w:t>
       </w:r>
     </w:p>
     <w:p>
@@ -203,57 +434,1049 @@
       </w:pPr>
       <w:r>
         <w:rPr>
-          <w:rFonts w:ascii="Aptos" w:hAnsi="Aptos" w:eastAsia="Microsoft JhengHei"/>
+          <w:sz w:val="21"/>
         </w:rPr>
-        <w:t>2.1 註冊</w:t>
+        <w:t>2.1 雲端與此裝置的差異</w:t>
+      </w:r>
+    </w:p>
+    <w:tbl>
+      <w:tblPr>
+        <w:tblStyle w:val="TableGrid"/>
+        <w:tblW w:type="auto" w:w="0"/>
+        <w:jc w:val="center"/>
+        <w:tblLook w:firstColumn="1" w:firstRow="1" w:lastColumn="0" w:lastRow="0" w:noHBand="0" w:noVBand="1" w:val="04A0"/>
+      </w:tblPr>
+      <w:tblGrid>
+        <w:gridCol w:w="3324"/>
+        <w:gridCol w:w="3324"/>
+        <w:gridCol w:w="3324"/>
+      </w:tblGrid>
+      <w:tr>
+        <w:tc>
+          <w:tcPr>
+            <w:tcW w:type="dxa" w:w="3324"/>
+            <w:shd w:fill="DDEBF2"/>
+          </w:tcPr>
+          <w:p>
+            <w:r>
+              <w:rPr>
+                <w:b/>
+              </w:rPr>
+              <w:t>項目</w:t>
+            </w:r>
+          </w:p>
+        </w:tc>
+        <w:tc>
+          <w:tcPr>
+            <w:tcW w:type="dxa" w:w="3324"/>
+            <w:shd w:fill="DDEBF2"/>
+          </w:tcPr>
+          <w:p>
+            <w:r>
+              <w:rPr>
+                <w:b/>
+              </w:rPr>
+              <w:t>雲端</w:t>
+            </w:r>
+          </w:p>
+        </w:tc>
+        <w:tc>
+          <w:tcPr>
+            <w:tcW w:type="dxa" w:w="3324"/>
+            <w:shd w:fill="DDEBF2"/>
+          </w:tcPr>
+          <w:p>
+            <w:r>
+              <w:rPr>
+                <w:b/>
+              </w:rPr>
+              <w:t>此裝置</w:t>
+            </w:r>
+          </w:p>
+        </w:tc>
+      </w:tr>
+      <w:tr>
+        <w:tc>
+          <w:tcPr>
+            <w:tcW w:type="dxa" w:w="3324"/>
+            <w:vAlign w:val="top"/>
+          </w:tcPr>
+          <w:p>
+            <w:r>
+              <w:t>跨裝置</w:t>
+            </w:r>
+          </w:p>
+        </w:tc>
+        <w:tc>
+          <w:tcPr>
+            <w:tcW w:type="dxa" w:w="3324"/>
+            <w:vAlign w:val="top"/>
+          </w:tcPr>
+          <w:p>
+            <w:r>
+              <w:t>可</w:t>
+            </w:r>
+          </w:p>
+        </w:tc>
+        <w:tc>
+          <w:tcPr>
+            <w:tcW w:type="dxa" w:w="3324"/>
+            <w:vAlign w:val="top"/>
+          </w:tcPr>
+          <w:p>
+            <w:r>
+              <w:t>不可</w:t>
+            </w:r>
+          </w:p>
+        </w:tc>
+      </w:tr>
+      <w:tr>
+        <w:tc>
+          <w:tcPr>
+            <w:tcW w:type="dxa" w:w="3324"/>
+            <w:vAlign w:val="top"/>
+          </w:tcPr>
+          <w:p>
+            <w:r>
+              <w:t>容量</w:t>
+            </w:r>
+          </w:p>
+        </w:tc>
+        <w:tc>
+          <w:tcPr>
+            <w:tcW w:type="dxa" w:w="3324"/>
+            <w:vAlign w:val="top"/>
+          </w:tcPr>
+          <w:p>
+            <w:r>
+              <w:t>依目前方案額度</w:t>
+            </w:r>
+          </w:p>
+        </w:tc>
+        <w:tc>
+          <w:tcPr>
+            <w:tcW w:type="dxa" w:w="3324"/>
+            <w:vAlign w:val="top"/>
+          </w:tcPr>
+          <w:p>
+            <w:r>
+              <w:t>不限筆數；受裝置空間限制</w:t>
+            </w:r>
+          </w:p>
+        </w:tc>
+      </w:tr>
+      <w:tr>
+        <w:tc>
+          <w:tcPr>
+            <w:tcW w:type="dxa" w:w="3324"/>
+            <w:vAlign w:val="top"/>
+          </w:tcPr>
+          <w:p>
+            <w:r>
+              <w:t>圖片</w:t>
+            </w:r>
+          </w:p>
+        </w:tc>
+        <w:tc>
+          <w:tcPr>
+            <w:tcW w:type="dxa" w:w="3324"/>
+            <w:vAlign w:val="top"/>
+          </w:tcPr>
+          <w:p>
+            <w:r>
+              <w:t>依方案</w:t>
+            </w:r>
+          </w:p>
+        </w:tc>
+        <w:tc>
+          <w:tcPr>
+            <w:tcW w:type="dxa" w:w="3324"/>
+            <w:vAlign w:val="top"/>
+          </w:tcPr>
+          <w:p>
+            <w:r>
+              <w:t>可使用；受裝置空間限制</w:t>
+            </w:r>
+          </w:p>
+        </w:tc>
+      </w:tr>
+      <w:tr>
+        <w:tc>
+          <w:tcPr>
+            <w:tcW w:type="dxa" w:w="3324"/>
+            <w:vAlign w:val="top"/>
+          </w:tcPr>
+          <w:p>
+            <w:r>
+              <w:t>行事曆分享</w:t>
+            </w:r>
+          </w:p>
+        </w:tc>
+        <w:tc>
+          <w:tcPr>
+            <w:tcW w:type="dxa" w:w="3324"/>
+            <w:vAlign w:val="top"/>
+          </w:tcPr>
+          <w:p>
+            <w:r>
+              <w:t>可</w:t>
+            </w:r>
+          </w:p>
+        </w:tc>
+        <w:tc>
+          <w:tcPr>
+            <w:tcW w:type="dxa" w:w="3324"/>
+            <w:vAlign w:val="top"/>
+          </w:tcPr>
+          <w:p>
+            <w:r>
+              <w:t>關閉</w:t>
+            </w:r>
+          </w:p>
+        </w:tc>
+      </w:tr>
+      <w:tr>
+        <w:tc>
+          <w:tcPr>
+            <w:tcW w:type="dxa" w:w="3324"/>
+            <w:vAlign w:val="top"/>
+          </w:tcPr>
+          <w:p>
+            <w:r>
+              <w:t>資料風險</w:t>
+            </w:r>
+          </w:p>
+        </w:tc>
+        <w:tc>
+          <w:tcPr>
+            <w:tcW w:type="dxa" w:w="3324"/>
+            <w:vAlign w:val="top"/>
+          </w:tcPr>
+          <w:p>
+            <w:r>
+              <w:t>帳號登入後可取回</w:t>
+            </w:r>
+          </w:p>
+        </w:tc>
+        <w:tc>
+          <w:tcPr>
+            <w:tcW w:type="dxa" w:w="3324"/>
+            <w:vAlign w:val="top"/>
+          </w:tcPr>
+          <w:p>
+            <w:r>
+              <w:t>清除網站資料、移除 App、換裝置或換瀏覽器可能看不到</w:t>
+            </w:r>
+          </w:p>
+        </w:tc>
+      </w:tr>
+      <w:tr>
+        <w:tc>
+          <w:tcPr>
+            <w:tcW w:type="dxa" w:w="3324"/>
+            <w:vAlign w:val="top"/>
+          </w:tcPr>
+          <w:p>
+            <w:r>
+              <w:t>主要用途</w:t>
+            </w:r>
+          </w:p>
+        </w:tc>
+        <w:tc>
+          <w:tcPr>
+            <w:tcW w:type="dxa" w:w="3324"/>
+            <w:vAlign w:val="top"/>
+          </w:tcPr>
+          <w:p>
+            <w:r>
+              <w:t>同步與分享</w:t>
+            </w:r>
+          </w:p>
+        </w:tc>
+        <w:tc>
+          <w:tcPr>
+            <w:tcW w:type="dxa" w:w="3324"/>
+            <w:vAlign w:val="top"/>
+          </w:tcPr>
+          <w:p>
+            <w:r>
+              <w:t>大量個人資料、離線或降低雲端用量</w:t>
+            </w:r>
+          </w:p>
+        </w:tc>
+      </w:tr>
+    </w:tbl>
+    <w:p/>
+    <w:p>
+      <w:pPr>
+        <w:pStyle w:val="Heading2"/>
+      </w:pPr>
+      <w:r>
+        <w:rPr>
+          <w:sz w:val="21"/>
+        </w:rPr>
+        <w:t>2.2 變更資料儲存位置</w:t>
       </w:r>
     </w:p>
     <w:p>
       <w:pPr>
         <w:pStyle w:val="ListNumber"/>
-        <w:spacing w:after="60"/>
       </w:pPr>
       <w:r>
         <w:rPr>
-          <w:rFonts w:ascii="Aptos" w:hAnsi="Aptos" w:eastAsia="Microsoft JhengHei"/>
+          <w:sz w:val="21"/>
         </w:rPr>
-        <w:t>在登入頁選擇註冊。</w:t>
+        <w:t>登入後開啟使用者選單。</w:t>
       </w:r>
     </w:p>
     <w:p>
       <w:pPr>
         <w:pStyle w:val="ListNumber"/>
-        <w:spacing w:after="60"/>
       </w:pPr>
       <w:r>
         <w:rPr>
-          <w:rFonts w:ascii="Aptos" w:hAnsi="Aptos" w:eastAsia="Microsoft JhengHei"/>
+          <w:sz w:val="21"/>
         </w:rPr>
-        <w:t>輸入有效 Email 與至少 8 個字元的密碼。</w:t>
+        <w:t>在「服務條款」與「資料匯出」之間選擇「資料儲存位置」。</w:t>
       </w:r>
     </w:p>
     <w:p>
       <w:pPr>
         <w:pStyle w:val="ListNumber"/>
-        <w:spacing w:after="60"/>
       </w:pPr>
       <w:r>
         <w:rPr>
-          <w:rFonts w:ascii="Aptos" w:hAnsi="Aptos" w:eastAsia="Microsoft JhengHei"/>
+          <w:sz w:val="21"/>
         </w:rPr>
-        <w:t>閱讀並同意服務條款與隱私權政策。</w:t>
+        <w:t>選擇「雲端」或「此裝置」。</w:t>
       </w:r>
     </w:p>
     <w:p>
       <w:pPr>
         <w:pStyle w:val="ListNumber"/>
-        <w:spacing w:after="60"/>
       </w:pPr>
       <w:r>
         <w:rPr>
-          <w:rFonts w:ascii="Aptos" w:hAnsi="Aptos" w:eastAsia="Microsoft JhengHei"/>
+          <w:sz w:val="21"/>
         </w:rPr>
-        <w:t>完成 Email 驗證後登入。</w:t>
+        <w:t>閱讀確認視窗：雲端轉本機會先複製、驗證，再刪除雲端來源；本機轉雲端會先檢查額度，成功後才刪除本機來源。</w:t>
+      </w:r>
+    </w:p>
+    <w:p>
+      <w:pPr>
+        <w:pStyle w:val="ListNumber"/>
+      </w:pPr>
+      <w:r>
+        <w:rPr>
+          <w:sz w:val="21"/>
+        </w:rPr>
+        <w:t>確認後等待完成訊息；成功時設定頁會關閉並重新整理資料。</w:t>
+      </w:r>
+    </w:p>
+    <w:tbl>
+      <w:tblPr>
+        <w:tblW w:type="auto" w:w="0"/>
+        <w:jc w:val="center"/>
+        <w:tblLook w:firstColumn="1" w:firstRow="1" w:lastColumn="0" w:lastRow="0" w:noHBand="0" w:noVBand="1" w:val="04A0"/>
+      </w:tblPr>
+      <w:tblGrid>
+        <w:gridCol w:w="9972"/>
+      </w:tblGrid>
+      <w:tr>
+        <w:tc>
+          <w:tcPr>
+            <w:tcW w:type="dxa" w:w="9972"/>
+            <w:shd w:fill="FCE4D6"/>
+          </w:tcPr>
+          <w:p>
+            <w:r>
+              <w:rPr>
+                <w:b/>
+              </w:rPr>
+              <w:t>重要：</w:t>
+            </w:r>
+            <w:r>
+              <w:t>兩種模式不是同時使用。搬移採整批處理；若任一資源超額或上傳失敗，該批資料保留在原位置並顯示原因。未來雖可支援本機轉雲端，目前仍必須符合當下方案額度。</w:t>
+            </w:r>
+          </w:p>
+        </w:tc>
+      </w:tr>
+    </w:tbl>
+    <w:p/>
+    <w:p>
+      <w:pPr>
+        <w:pStyle w:val="Heading2"/>
+      </w:pPr>
+      <w:r>
+        <w:rPr>
+          <w:sz w:val="21"/>
+        </w:rPr>
+        <w:t>2.3 Web 本機資料在哪裡</w:t>
+      </w:r>
+    </w:p>
+    <w:p>
+      <w:r>
+        <w:rPr>
+          <w:sz w:val="21"/>
+        </w:rPr>
+        <w:t>Chrome／Edge 的本機資料位於該網站的 IndexedDB。Hot reload 通常不會清除；但清除網站資料、瀏覽器資料、使用無痕模式、換瀏覽器或換電腦後不會自動出現。請定期使用資料匯出保存副本。</w:t>
+      </w:r>
+    </w:p>
+    <w:p>
+      <w:pPr>
+        <w:pStyle w:val="Heading1"/>
+      </w:pPr>
+      <w:r>
+        <w:rPr>
+          <w:sz w:val="21"/>
+        </w:rPr>
+        <w:t>3. 方案、付費與額度</w:t>
+      </w:r>
+    </w:p>
+    <w:p>
+      <w:r>
+        <w:rPr>
+          <w:sz w:val="21"/>
+        </w:rPr>
+        <w:t>方案頁最上方會顯示目前方案、有效日期、版本、倍率與實際使用量。打勾表示目前生效的方案；「∞」代表此裝置不限筆數，不應顯示資料庫的大整數。</w:t>
+      </w:r>
+    </w:p>
+    <w:tbl>
+      <w:tblPr>
+        <w:tblStyle w:val="TableGrid"/>
+        <w:tblW w:type="auto" w:w="0"/>
+        <w:jc w:val="center"/>
+        <w:tblLook w:firstColumn="1" w:firstRow="1" w:lastColumn="0" w:lastRow="0" w:noHBand="0" w:noVBand="1" w:val="04A0"/>
+      </w:tblPr>
+      <w:tblGrid>
+        <w:gridCol w:w="2493"/>
+        <w:gridCol w:w="2493"/>
+        <w:gridCol w:w="2493"/>
+        <w:gridCol w:w="2493"/>
+      </w:tblGrid>
+      <w:tr>
+        <w:tc>
+          <w:tcPr>
+            <w:tcW w:type="dxa" w:w="2493"/>
+            <w:shd w:fill="DDEBF2"/>
+          </w:tcPr>
+          <w:p>
+            <w:r>
+              <w:rPr>
+                <w:b/>
+              </w:rPr>
+              <w:t>資源</w:t>
+            </w:r>
+          </w:p>
+        </w:tc>
+        <w:tc>
+          <w:tcPr>
+            <w:tcW w:type="dxa" w:w="2493"/>
+            <w:shd w:fill="DDEBF2"/>
+          </w:tcPr>
+          <w:p>
+            <w:r>
+              <w:rPr>
+                <w:b/>
+              </w:rPr>
+              <w:t>免費雲端</w:t>
+            </w:r>
+          </w:p>
+        </w:tc>
+        <w:tc>
+          <w:tcPr>
+            <w:tcW w:type="dxa" w:w="2493"/>
+            <w:shd w:fill="DDEBF2"/>
+          </w:tcPr>
+          <w:p>
+            <w:r>
+              <w:rPr>
+                <w:b/>
+              </w:rPr>
+              <w:t>Plus 雲端（基準）</w:t>
+            </w:r>
+          </w:p>
+        </w:tc>
+        <w:tc>
+          <w:tcPr>
+            <w:tcW w:type="dxa" w:w="2493"/>
+            <w:shd w:fill="DDEBF2"/>
+          </w:tcPr>
+          <w:p>
+            <w:r>
+              <w:rPr>
+                <w:b/>
+              </w:rPr>
+              <w:t>此裝置</w:t>
+            </w:r>
+          </w:p>
+        </w:tc>
+      </w:tr>
+      <w:tr>
+        <w:tc>
+          <w:tcPr>
+            <w:tcW w:type="dxa" w:w="2493"/>
+            <w:vAlign w:val="top"/>
+          </w:tcPr>
+          <w:p>
+            <w:r>
+              <w:t>行事曆</w:t>
+            </w:r>
+          </w:p>
+        </w:tc>
+        <w:tc>
+          <w:tcPr>
+            <w:tcW w:type="dxa" w:w="2493"/>
+            <w:vAlign w:val="top"/>
+          </w:tcPr>
+          <w:p>
+            <w:r>
+              <w:t>30 筆</w:t>
+            </w:r>
+          </w:p>
+        </w:tc>
+        <w:tc>
+          <w:tcPr>
+            <w:tcW w:type="dxa" w:w="2493"/>
+            <w:vAlign w:val="top"/>
+          </w:tcPr>
+          <w:p>
+            <w:r>
+              <w:t>300 筆</w:t>
+            </w:r>
+          </w:p>
+        </w:tc>
+        <w:tc>
+          <w:tcPr>
+            <w:tcW w:type="dxa" w:w="2493"/>
+            <w:vAlign w:val="top"/>
+          </w:tcPr>
+          <w:p>
+            <w:r>
+              <w:t>不限</w:t>
+            </w:r>
+          </w:p>
+        </w:tc>
+      </w:tr>
+      <w:tr>
+        <w:tc>
+          <w:tcPr>
+            <w:tcW w:type="dxa" w:w="2493"/>
+            <w:vAlign w:val="top"/>
+          </w:tcPr>
+          <w:p>
+            <w:r>
+              <w:t>記帳明細</w:t>
+            </w:r>
+          </w:p>
+        </w:tc>
+        <w:tc>
+          <w:tcPr>
+            <w:tcW w:type="dxa" w:w="2493"/>
+            <w:vAlign w:val="top"/>
+          </w:tcPr>
+          <w:p>
+            <w:r>
+              <w:t>30 筆</w:t>
+            </w:r>
+          </w:p>
+        </w:tc>
+        <w:tc>
+          <w:tcPr>
+            <w:tcW w:type="dxa" w:w="2493"/>
+            <w:vAlign w:val="top"/>
+          </w:tcPr>
+          <w:p>
+            <w:r>
+              <w:t>300 筆</w:t>
+            </w:r>
+          </w:p>
+        </w:tc>
+        <w:tc>
+          <w:tcPr>
+            <w:tcW w:type="dxa" w:w="2493"/>
+            <w:vAlign w:val="top"/>
+          </w:tcPr>
+          <w:p>
+            <w:r>
+              <w:t>不限</w:t>
+            </w:r>
+          </w:p>
+        </w:tc>
+      </w:tr>
+      <w:tr>
+        <w:tc>
+          <w:tcPr>
+            <w:tcW w:type="dxa" w:w="2493"/>
+            <w:vAlign w:val="top"/>
+          </w:tcPr>
+          <w:p>
+            <w:r>
+              <w:t>積分明細</w:t>
+            </w:r>
+          </w:p>
+        </w:tc>
+        <w:tc>
+          <w:tcPr>
+            <w:tcW w:type="dxa" w:w="2493"/>
+            <w:vAlign w:val="top"/>
+          </w:tcPr>
+          <w:p>
+            <w:r>
+              <w:t>30 筆</w:t>
+            </w:r>
+          </w:p>
+        </w:tc>
+        <w:tc>
+          <w:tcPr>
+            <w:tcW w:type="dxa" w:w="2493"/>
+            <w:vAlign w:val="top"/>
+          </w:tcPr>
+          <w:p>
+            <w:r>
+              <w:t>300 筆</w:t>
+            </w:r>
+          </w:p>
+        </w:tc>
+        <w:tc>
+          <w:tcPr>
+            <w:tcW w:type="dxa" w:w="2493"/>
+            <w:vAlign w:val="top"/>
+          </w:tcPr>
+          <w:p>
+            <w:r>
+              <w:t>不限</w:t>
+            </w:r>
+          </w:p>
+        </w:tc>
+      </w:tr>
+      <w:tr>
+        <w:tc>
+          <w:tcPr>
+            <w:tcW w:type="dxa" w:w="2493"/>
+            <w:vAlign w:val="top"/>
+          </w:tcPr>
+          <w:p>
+            <w:r>
+              <w:t>回憶</w:t>
+            </w:r>
+          </w:p>
+        </w:tc>
+        <w:tc>
+          <w:tcPr>
+            <w:tcW w:type="dxa" w:w="2493"/>
+            <w:vAlign w:val="top"/>
+          </w:tcPr>
+          <w:p>
+            <w:r>
+              <w:t>30 筆</w:t>
+            </w:r>
+          </w:p>
+        </w:tc>
+        <w:tc>
+          <w:tcPr>
+            <w:tcW w:type="dxa" w:w="2493"/>
+            <w:vAlign w:val="top"/>
+          </w:tcPr>
+          <w:p>
+            <w:r>
+              <w:t>300 筆</w:t>
+            </w:r>
+          </w:p>
+        </w:tc>
+        <w:tc>
+          <w:tcPr>
+            <w:tcW w:type="dxa" w:w="2493"/>
+            <w:vAlign w:val="top"/>
+          </w:tcPr>
+          <w:p>
+            <w:r>
+              <w:t>不限</w:t>
+            </w:r>
+          </w:p>
+        </w:tc>
+      </w:tr>
+      <w:tr>
+        <w:tc>
+          <w:tcPr>
+            <w:tcW w:type="dxa" w:w="2493"/>
+            <w:vAlign w:val="top"/>
+          </w:tcPr>
+          <w:p>
+            <w:r>
+              <w:t>自建遊戲題目</w:t>
+            </w:r>
+          </w:p>
+        </w:tc>
+        <w:tc>
+          <w:tcPr>
+            <w:tcW w:type="dxa" w:w="2493"/>
+            <w:vAlign w:val="top"/>
+          </w:tcPr>
+          <w:p>
+            <w:r>
+              <w:t>50 題</w:t>
+            </w:r>
+          </w:p>
+        </w:tc>
+        <w:tc>
+          <w:tcPr>
+            <w:tcW w:type="dxa" w:w="2493"/>
+            <w:vAlign w:val="top"/>
+          </w:tcPr>
+          <w:p>
+            <w:r>
+              <w:t>500 題</w:t>
+            </w:r>
+          </w:p>
+        </w:tc>
+        <w:tc>
+          <w:tcPr>
+            <w:tcW w:type="dxa" w:w="2493"/>
+            <w:vAlign w:val="top"/>
+          </w:tcPr>
+          <w:p>
+            <w:r>
+              <w:t>不限</w:t>
+            </w:r>
+          </w:p>
+        </w:tc>
+      </w:tr>
+      <w:tr>
+        <w:tc>
+          <w:tcPr>
+            <w:tcW w:type="dxa" w:w="2493"/>
+            <w:vAlign w:val="top"/>
+          </w:tcPr>
+          <w:p>
+            <w:r>
+              <w:t>行事曆分享</w:t>
+            </w:r>
+          </w:p>
+        </w:tc>
+        <w:tc>
+          <w:tcPr>
+            <w:tcW w:type="dxa" w:w="2493"/>
+            <w:vAlign w:val="top"/>
+          </w:tcPr>
+          <w:p>
+            <w:r>
+              <w:t>2 人</w:t>
+            </w:r>
+          </w:p>
+        </w:tc>
+        <w:tc>
+          <w:tcPr>
+            <w:tcW w:type="dxa" w:w="2493"/>
+            <w:vAlign w:val="top"/>
+          </w:tcPr>
+          <w:p>
+            <w:r>
+              <w:t>5 人</w:t>
+            </w:r>
+          </w:p>
+        </w:tc>
+        <w:tc>
+          <w:tcPr>
+            <w:tcW w:type="dxa" w:w="2493"/>
+            <w:vAlign w:val="top"/>
+          </w:tcPr>
+          <w:p>
+            <w:r>
+              <w:t>不提供</w:t>
+            </w:r>
+          </w:p>
+        </w:tc>
+      </w:tr>
+      <w:tr>
+        <w:tc>
+          <w:tcPr>
+            <w:tcW w:type="dxa" w:w="2493"/>
+            <w:vAlign w:val="top"/>
+          </w:tcPr>
+          <w:p>
+            <w:r>
+              <w:t>圖片</w:t>
+            </w:r>
+          </w:p>
+        </w:tc>
+        <w:tc>
+          <w:tcPr>
+            <w:tcW w:type="dxa" w:w="2493"/>
+            <w:vAlign w:val="top"/>
+          </w:tcPr>
+          <w:p>
+            <w:r>
+              <w:t>不提供</w:t>
+            </w:r>
+          </w:p>
+        </w:tc>
+        <w:tc>
+          <w:tcPr>
+            <w:tcW w:type="dxa" w:w="2493"/>
+            <w:vAlign w:val="top"/>
+          </w:tcPr>
+          <w:p>
+            <w:r>
+              <w:t>300 MB</w:t>
+            </w:r>
+          </w:p>
+        </w:tc>
+        <w:tc>
+          <w:tcPr>
+            <w:tcW w:type="dxa" w:w="2493"/>
+            <w:vAlign w:val="top"/>
+          </w:tcPr>
+          <w:p>
+            <w:r>
+              <w:t>受裝置空間限制</w:t>
+            </w:r>
+          </w:p>
+        </w:tc>
+      </w:tr>
+      <w:tr>
+        <w:tc>
+          <w:tcPr>
+            <w:tcW w:type="dxa" w:w="2493"/>
+            <w:vAlign w:val="top"/>
+          </w:tcPr>
+          <w:p>
+            <w:r>
+              <w:t>答題明細</w:t>
+            </w:r>
+          </w:p>
+        </w:tc>
+        <w:tc>
+          <w:tcPr>
+            <w:tcW w:type="dxa" w:w="2493"/>
+            <w:vAlign w:val="top"/>
+          </w:tcPr>
+          <w:p>
+            <w:r>
+              <w:t>雲端近 30 天</w:t>
+            </w:r>
+          </w:p>
+        </w:tc>
+        <w:tc>
+          <w:tcPr>
+            <w:tcW w:type="dxa" w:w="2493"/>
+            <w:vAlign w:val="top"/>
+          </w:tcPr>
+          <w:p>
+            <w:r>
+              <w:t>雲端近 1 年</w:t>
+            </w:r>
+          </w:p>
+        </w:tc>
+        <w:tc>
+          <w:tcPr>
+            <w:tcW w:type="dxa" w:w="2493"/>
+            <w:vAlign w:val="top"/>
+          </w:tcPr>
+          <w:p>
+            <w:r>
+              <w:t>永久保留</w:t>
+            </w:r>
+          </w:p>
+        </w:tc>
+      </w:tr>
+      <w:tr>
+        <w:tc>
+          <w:tcPr>
+            <w:tcW w:type="dxa" w:w="2493"/>
+            <w:vAlign w:val="top"/>
+          </w:tcPr>
+          <w:p>
+            <w:r>
+              <w:t>股票／Business Plan</w:t>
+            </w:r>
+          </w:p>
+        </w:tc>
+        <w:tc>
+          <w:tcPr>
+            <w:tcW w:type="dxa" w:w="2493"/>
+            <w:vAlign w:val="top"/>
+          </w:tcPr>
+          <w:p>
+            <w:r>
+              <w:t>管理者限定</w:t>
+            </w:r>
+          </w:p>
+        </w:tc>
+        <w:tc>
+          <w:tcPr>
+            <w:tcW w:type="dxa" w:w="2493"/>
+            <w:vAlign w:val="top"/>
+          </w:tcPr>
+          <w:p>
+            <w:r>
+              <w:t>管理者限定</w:t>
+            </w:r>
+          </w:p>
+        </w:tc>
+        <w:tc>
+          <w:tcPr>
+            <w:tcW w:type="dxa" w:w="2493"/>
+            <w:vAlign w:val="top"/>
+          </w:tcPr>
+          <w:p>
+            <w:r>
+              <w:t>管理者限定</w:t>
+            </w:r>
+          </w:p>
+        </w:tc>
+      </w:tr>
+    </w:tbl>
+    <w:p/>
+    <w:p>
+      <w:pPr>
+        <w:pStyle w:val="ListBullet"/>
+      </w:pPr>
+      <w:r>
+        <w:rPr>
+          <w:sz w:val="21"/>
+        </w:rPr>
+        <w:t>基準費用為每季 NT$129；實際價格、版本與生效日以方案頁為準。</w:t>
+      </w:r>
+    </w:p>
+    <w:p>
+      <w:pPr>
+        <w:pStyle w:val="ListBullet"/>
+      </w:pPr>
+      <w:r>
+        <w:rPr>
+          <w:sz w:val="21"/>
+        </w:rPr>
+        <w:t>若付款倍率為 2 倍，例如 NT$258，該次新增權益依新版額度乘 2；尚未到期的舊權益會同時保留。</w:t>
+      </w:r>
+    </w:p>
+    <w:p>
+      <w:pPr>
+        <w:pStyle w:val="ListBullet"/>
+      </w:pPr>
+      <w:r>
+        <w:rPr>
+          <w:sz w:val="21"/>
+        </w:rPr>
+        <w:t>取消續訂仍可使用至已付款期間結束。</w:t>
+      </w:r>
+    </w:p>
+    <w:p>
+      <w:pPr>
+        <w:pStyle w:val="ListBullet"/>
+      </w:pPr>
+      <w:r>
+        <w:rPr>
+          <w:sz w:val="21"/>
+        </w:rPr>
+        <w:t>到期或付款失敗後，雲端先進入唯讀：可查看、匯出或搬移，不能新增。若仍在免費額度內可回到免費方案。</w:t>
+      </w:r>
+    </w:p>
+    <w:p>
+      <w:pPr>
+        <w:pStyle w:val="ListBullet"/>
+      </w:pPr>
+      <w:r>
+        <w:rPr>
+          <w:sz w:val="21"/>
+        </w:rPr>
+        <w:t>超額資料在 30 天內可續訂或搬到本機；期滿清理時優先保留最新資料及「保留項」。</w:t>
+      </w:r>
+    </w:p>
+    <w:p>
+      <w:pPr>
+        <w:pStyle w:val="ListBullet"/>
+      </w:pPr>
+      <w:r>
+        <w:rPr>
+          <w:sz w:val="21"/>
+        </w:rPr>
+        <w:t>免費帳戶若連續 3 個月沒有新增或修改資料，可能被視為無效帳戶並清理雲端資料。</w:t>
+      </w:r>
+    </w:p>
+    <w:p>
+      <w:pPr>
+        <w:pStyle w:val="Heading1"/>
+      </w:pPr>
+      <w:r>
+        <w:rPr>
+          <w:sz w:val="21"/>
+        </w:rPr>
+        <w:t>4. 首頁</w:t>
+      </w:r>
+    </w:p>
+    <w:p>
+      <w:r>
+        <w:rPr>
+          <w:sz w:val="21"/>
+        </w:rPr>
+        <w:t>首頁整合近期行程、推薦活動、推薦景點、今日與總金額、今日與總積分。先選擇記帳或積分帳戶；個人帳戶全部列出，旅程／團體帳戶只顯示最近使用的 2 個。切換帳戶後首頁應自動重新載入。</w:t>
+      </w:r>
+    </w:p>
+    <w:p>
+      <w:pPr>
+        <w:pStyle w:val="ListBullet"/>
+      </w:pPr>
+      <w:r>
+        <w:rPr>
+          <w:sz w:val="21"/>
+        </w:rPr>
+        <w:t>TODAY：只計算今天。</w:t>
+      </w:r>
+    </w:p>
+    <w:p>
+      <w:pPr>
+        <w:pStyle w:val="ListBullet"/>
+      </w:pPr>
+      <w:r>
+        <w:rPr>
+          <w:sz w:val="21"/>
+        </w:rPr>
+        <w:t>TOTAL：依帳戶所有有效明細計算。</w:t>
+      </w:r>
+    </w:p>
+    <w:p>
+      <w:pPr>
+        <w:pStyle w:val="ListBullet"/>
+      </w:pPr>
+      <w:r>
+        <w:rPr>
+          <w:sz w:val="21"/>
+        </w:rPr>
+        <w:t>記帳幣別顯示帳戶的主要幣別，不固定寫 TWD。</w:t>
+      </w:r>
+    </w:p>
+    <w:p>
+      <w:pPr>
+        <w:pStyle w:val="ListBullet"/>
+      </w:pPr>
+      <w:r>
+        <w:rPr>
+          <w:sz w:val="21"/>
+        </w:rPr>
+        <w:t>若尚未選帳戶，不應顯示其他帳戶的 0 元假明細。</w:t>
+      </w:r>
+    </w:p>
+    <w:p>
+      <w:pPr>
+        <w:pStyle w:val="ListBullet"/>
+      </w:pPr>
+      <w:r>
+        <w:rPr>
+          <w:sz w:val="21"/>
+        </w:rPr>
+        <w:t>將推薦活動或景點加入行事曆後，會依目前資料模式寫入並出現在對應日期。</w:t>
+      </w:r>
+    </w:p>
+    <w:p>
+      <w:pPr>
+        <w:pStyle w:val="Heading1"/>
+      </w:pPr>
+      <w:r>
+        <w:rPr>
+          <w:sz w:val="21"/>
+        </w:rPr>
+        <w:t>5. 行事曆</w:t>
       </w:r>
     </w:p>
     <w:p>
@@ -262,17 +1485,75 @@
       </w:pPr>
       <w:r>
         <w:rPr>
-          <w:rFonts w:ascii="Aptos" w:hAnsi="Aptos" w:eastAsia="Microsoft JhengHei"/>
+          <w:sz w:val="21"/>
         </w:rPr>
-        <w:t>2.2 登入</w:t>
+        <w:t>5.1 新增、查看、編輯、刪除</w:t>
       </w:r>
     </w:p>
     <w:p>
+      <w:pPr>
+        <w:pStyle w:val="ListNumber"/>
+      </w:pPr>
       <w:r>
         <w:rPr>
-          <w:rFonts w:ascii="Aptos" w:hAnsi="Aptos" w:eastAsia="Microsoft JhengHei"/>
+          <w:sz w:val="21"/>
         </w:rPr>
-        <w:t>登入後，系統會依該帳號上次選擇的資料位置讀取資料；從未選擇者預設使用雲端。</w:t>
+        <w:t>從功能選單進入行事曆，點日期查看當日事件。</w:t>
+      </w:r>
+    </w:p>
+    <w:p>
+      <w:pPr>
+        <w:pStyle w:val="ListNumber"/>
+      </w:pPr>
+      <w:r>
+        <w:rPr>
+          <w:sz w:val="21"/>
+        </w:rPr>
+        <w:t>點新增，輸入名稱、開始日期；結束日期可空白，同日結束亦有效。</w:t>
+      </w:r>
+    </w:p>
+    <w:p>
+      <w:pPr>
+        <w:pStyle w:val="ListNumber"/>
+      </w:pPr>
+      <w:r>
+        <w:rPr>
+          <w:sz w:val="21"/>
+        </w:rPr>
+        <w:t>國家使用下拉選單，預設 TW；城市、地點與時間可依需要輸入。</w:t>
+      </w:r>
+    </w:p>
+    <w:p>
+      <w:pPr>
+        <w:pStyle w:val="ListNumber"/>
+      </w:pPr>
+      <w:r>
+        <w:rPr>
+          <w:sz w:val="21"/>
+        </w:rPr>
+        <w:t>可選圖片；雲端圖片受方案限制，本機圖片受裝置空間限制。</w:t>
+      </w:r>
+    </w:p>
+    <w:p>
+      <w:pPr>
+        <w:pStyle w:val="ListNumber"/>
+      </w:pPr>
+      <w:r>
+        <w:rPr>
+          <w:sz w:val="21"/>
+        </w:rPr>
+        <w:t>儲存後回到月曆，跨週或跨月事件應在每個涵蓋日期可見。</w:t>
+      </w:r>
+    </w:p>
+    <w:p>
+      <w:pPr>
+        <w:pStyle w:val="ListNumber"/>
+      </w:pPr>
+      <w:r>
+        <w:rPr>
+          <w:sz w:val="21"/>
+        </w:rPr>
+        <w:t>只有自己建立的事件能編輯或刪除；別人分享的事件為唯讀。</w:t>
       </w:r>
     </w:p>
     <w:p>
@@ -281,65 +1562,94 @@
       </w:pPr>
       <w:r>
         <w:rPr>
-          <w:rFonts w:ascii="Aptos" w:hAnsi="Aptos" w:eastAsia="Microsoft JhengHei"/>
+          <w:sz w:val="21"/>
         </w:rPr>
-        <w:t>2.3 重設密碼</w:t>
+        <w:t>5.2 天氣</w:t>
+      </w:r>
+    </w:p>
+    <w:p>
+      <w:r>
+        <w:rPr>
+          <w:sz w:val="21"/>
+        </w:rPr>
+        <w:t>天氣只在可預報日期與可定位資料存在時顯示。日期旁不重複顯示相同天氣文字；超過預報範圍不代表行程遺失。</w:t>
+      </w:r>
+    </w:p>
+    <w:p>
+      <w:pPr>
+        <w:pStyle w:val="Heading2"/>
+      </w:pPr>
+      <w:r>
+        <w:rPr>
+          <w:sz w:val="21"/>
+        </w:rPr>
+        <w:t>5.3 分享行事曆</w:t>
       </w:r>
     </w:p>
     <w:p>
       <w:pPr>
         <w:pStyle w:val="ListNumber"/>
-        <w:spacing w:after="60"/>
       </w:pPr>
       <w:r>
         <w:rPr>
-          <w:rFonts w:ascii="Aptos" w:hAnsi="Aptos" w:eastAsia="Microsoft JhengHei"/>
+          <w:sz w:val="21"/>
         </w:rPr>
-        <w:t>在登入頁選擇忘記密碼。</w:t>
+        <w:t>確認目前是雲端模式。</w:t>
       </w:r>
     </w:p>
     <w:p>
       <w:pPr>
         <w:pStyle w:val="ListNumber"/>
-        <w:spacing w:after="60"/>
       </w:pPr>
       <w:r>
         <w:rPr>
-          <w:rFonts w:ascii="Aptos" w:hAnsi="Aptos" w:eastAsia="Microsoft JhengHei"/>
+          <w:sz w:val="21"/>
         </w:rPr>
-        <w:t>輸入註冊 Email。</w:t>
+        <w:t>開啟分享管理，輸入對方註冊 Email。最近一次分享帳號可作為預設。</w:t>
       </w:r>
     </w:p>
     <w:p>
       <w:pPr>
         <w:pStyle w:val="ListNumber"/>
-        <w:spacing w:after="60"/>
       </w:pPr>
       <w:r>
         <w:rPr>
-          <w:rFonts w:ascii="Aptos" w:hAnsi="Aptos" w:eastAsia="Microsoft JhengHei"/>
+          <w:sz w:val="21"/>
         </w:rPr>
-        <w:t>開啟重設密碼郵件中的連結。</w:t>
+        <w:t>選擇全部分享，或只勾選目前月份畫面中尚未過期、由近到遠排列的事件。</w:t>
       </w:r>
     </w:p>
     <w:p>
       <w:pPr>
         <w:pStyle w:val="ListNumber"/>
-        <w:spacing w:after="60"/>
       </w:pPr>
       <w:r>
         <w:rPr>
-          <w:rFonts w:ascii="Aptos" w:hAnsi="Aptos" w:eastAsia="Microsoft JhengHei"/>
+          <w:sz w:val="21"/>
         </w:rPr>
-        <w:t>回到 Life Pilot 的重設密碼頁設定新密碼。</w:t>
+        <w:t>對方接受後，對方月曆會同時顯示自己的事件與分享事件，並以顏色區分。</w:t>
       </w:r>
     </w:p>
     <w:p>
+      <w:pPr>
+        <w:pStyle w:val="ListNumber"/>
+      </w:pPr>
       <w:r>
         <w:rPr>
-          <w:rFonts w:ascii="Aptos" w:hAnsi="Aptos" w:eastAsia="Microsoft JhengHei"/>
+          <w:sz w:val="21"/>
         </w:rPr>
-        <w:t>若連結未開啟 App，請確認使用的是最新一封郵件、連結尚未過期，並重新發送一次。</w:t>
+        <w:t>分享者可在「管理已分享事件」逐筆取消，或全部停止分享。</w:t>
+      </w:r>
+    </w:p>
+    <w:p>
+      <w:pPr>
+        <w:pStyle w:val="ListNumber"/>
+      </w:pPr>
+      <w:r>
+        <w:rPr>
+          <w:sz w:val="21"/>
+        </w:rPr>
+        <w:t>接收者可在接受後停止查看；雙方任何一方取消後，相關分享事件均不再顯示。</w:t>
       </w:r>
     </w:p>
     <w:p>
@@ -348,9 +1658,212 @@
       </w:pPr>
       <w:r>
         <w:rPr>
-          <w:rFonts w:ascii="Aptos" w:hAnsi="Aptos" w:eastAsia="Microsoft JhengHei"/>
+          <w:sz w:val="21"/>
         </w:rPr>
-        <w:t>3. 雲端模式與此裝置模式</w:t>
+        <w:t>6. 記帳</w:t>
+      </w:r>
+    </w:p>
+    <w:p>
+      <w:pPr>
+        <w:pStyle w:val="ListNumber"/>
+      </w:pPr>
+      <w:r>
+        <w:rPr>
+          <w:sz w:val="21"/>
+        </w:rPr>
+        <w:t>建立或選擇記帳帳戶，設定名稱與主要幣別。</w:t>
+      </w:r>
+    </w:p>
+    <w:p>
+      <w:pPr>
+        <w:pStyle w:val="ListNumber"/>
+      </w:pPr>
+      <w:r>
+        <w:rPr>
+          <w:sz w:val="21"/>
+        </w:rPr>
+        <w:t>新增明細：輸入金額、收支類型、日期、說明。</w:t>
+      </w:r>
+    </w:p>
+    <w:p>
+      <w:pPr>
+        <w:pStyle w:val="ListNumber"/>
+      </w:pPr>
+      <w:r>
+        <w:rPr>
+          <w:sz w:val="21"/>
+        </w:rPr>
+        <w:t>選一級分類：食、衣、住、行、育、樂、未分類或保留項；二級分類可自訂也可留空。</w:t>
+      </w:r>
+    </w:p>
+    <w:p>
+      <w:pPr>
+        <w:pStyle w:val="ListNumber"/>
+      </w:pPr>
+      <w:r>
+        <w:rPr>
+          <w:sz w:val="21"/>
+        </w:rPr>
+        <w:t>明細依 date 排序；編輯時可修改日期、幣別、金額、說明與兩級分類。</w:t>
+      </w:r>
+    </w:p>
+    <w:p>
+      <w:pPr>
+        <w:pStyle w:val="ListNumber"/>
+      </w:pPr>
+      <w:r>
+        <w:rPr>
+          <w:sz w:val="21"/>
+        </w:rPr>
+        <w:t>刪除明細後，今日小計與總金額會立即重算。</w:t>
+      </w:r>
+    </w:p>
+    <w:p>
+      <w:pPr>
+        <w:pStyle w:val="ListNumber"/>
+      </w:pPr>
+      <w:r>
+        <w:rPr>
+          <w:sz w:val="21"/>
+        </w:rPr>
+        <w:t>預設讀取近 30 天；無資料時顯示最新一筆；按「載入更多」每次向前載入且自動去重。</w:t>
+      </w:r>
+    </w:p>
+    <w:tbl>
+      <w:tblPr>
+        <w:tblW w:type="auto" w:w="0"/>
+        <w:jc w:val="center"/>
+        <w:tblLook w:firstColumn="1" w:firstRow="1" w:lastColumn="0" w:lastRow="0" w:noHBand="0" w:noVBand="1" w:val="04A0"/>
+      </w:tblPr>
+      <w:tblGrid>
+        <w:gridCol w:w="9972"/>
+      </w:tblGrid>
+      <w:tr>
+        <w:tc>
+          <w:tcPr>
+            <w:tcW w:type="dxa" w:w="9972"/>
+            <w:shd w:fill="E8F3F6"/>
+          </w:tcPr>
+          <w:p>
+            <w:r>
+              <w:rPr>
+                <w:b/>
+              </w:rPr>
+              <w:t>保留項：</w:t>
+            </w:r>
+            <w:r>
+              <w:t>舊資料中含「餘」的特殊紀錄已改為保留項。保留項不受 30 天視窗影響，請勿當一般消費紀錄使用。</w:t>
+            </w:r>
+          </w:p>
+        </w:tc>
+      </w:tr>
+    </w:tbl>
+    <w:p/>
+    <w:p>
+      <w:pPr>
+        <w:pStyle w:val="Heading1"/>
+      </w:pPr>
+      <w:r>
+        <w:rPr>
+          <w:sz w:val="21"/>
+        </w:rPr>
+        <w:t>7. 積分</w:t>
+      </w:r>
+    </w:p>
+    <w:p>
+      <w:r>
+        <w:rPr>
+          <w:sz w:val="21"/>
+        </w:rPr>
+        <w:t>流程與記帳相同；一級分類為德、智、體、群、美、未分類、保留項，二級分類可留空。旅程文字顯示為「團體」。刪除後今日與總積分會重新計算。</w:t>
+      </w:r>
+    </w:p>
+    <w:p>
+      <w:pPr>
+        <w:pStyle w:val="Heading1"/>
+      </w:pPr>
+      <w:r>
+        <w:rPr>
+          <w:sz w:val="21"/>
+        </w:rPr>
+        <w:t>8. 推薦活動</w:t>
+      </w:r>
+    </w:p>
+    <w:p>
+      <w:pPr>
+        <w:pStyle w:val="ListBullet"/>
+      </w:pPr>
+      <w:r>
+        <w:rPr>
+          <w:sz w:val="21"/>
+        </w:rPr>
+        <w:t>支援城市、日期、關鍵字與清單／地圖模式。搜尋文字命中其他城市且目前城市沒有資料時，可切換到相符城市。</w:t>
+      </w:r>
+    </w:p>
+    <w:p>
+      <w:pPr>
+        <w:pStyle w:val="ListBullet"/>
+      </w:pPr>
+      <w:r>
+        <w:rPr>
+          <w:sz w:val="21"/>
+        </w:rPr>
+        <w:t>排序為喜歡 → 一般 → 不喜歡；各群組內，未開始／當天活動依開始日期由近到遠，已開始活動依結束日期；同日期再依開始時間、城市、地點、名稱。</w:t>
+      </w:r>
+    </w:p>
+    <w:p>
+      <w:pPr>
+        <w:pStyle w:val="ListBullet"/>
+      </w:pPr>
+      <w:r>
+        <w:rPr>
+          <w:sz w:val="21"/>
+        </w:rPr>
+        <w:t>按不喜歡不會刪除，會移到後方。</w:t>
+      </w:r>
+    </w:p>
+    <w:p>
+      <w:pPr>
+        <w:pStyle w:val="ListBullet"/>
+      </w:pPr>
+      <w:r>
+        <w:rPr>
+          <w:sz w:val="21"/>
+        </w:rPr>
+        <w:t>只有存在 subEvents 細項時，點卡片才開啟 Preview；沒有細項時卡片本身即呈現完整資訊。</w:t>
+      </w:r>
+    </w:p>
+    <w:p>
+      <w:pPr>
+        <w:pStyle w:val="ListBullet"/>
+      </w:pPr>
+      <w:r>
+        <w:rPr>
+          <w:sz w:val="21"/>
+        </w:rPr>
+        <w:t>天氣只預抓畫面可見且 8 天內的活動；往下滑時再逐步載入。</w:t>
+      </w:r>
+    </w:p>
+    <w:p>
+      <w:pPr>
+        <w:pStyle w:val="ListBullet"/>
+      </w:pPr>
+      <w:r>
+        <w:rPr>
+          <w:sz w:val="21"/>
+        </w:rPr>
+        <w:t>手機使用者可能看到「更新」按鈕；同日已更新或已有工作進行中時不重複觸發。</w:t>
+      </w:r>
+    </w:p>
+    <w:p>
+      <w:pPr>
+        <w:pStyle w:val="ListBullet"/>
+      </w:pPr>
+      <w:r>
+        <w:rPr>
+          <w:sz w:val="21"/>
+        </w:rPr>
+        <w:t>管理者刪除的匯入活動會留下刪除標記，避免下次更新又出現。</w:t>
       </w:r>
     </w:p>
     <w:p>
@@ -359,45 +1872,275 @@
       </w:pPr>
       <w:r>
         <w:rPr>
-          <w:rFonts w:ascii="Aptos" w:hAnsi="Aptos" w:eastAsia="Microsoft JhengHei"/>
+          <w:sz w:val="21"/>
         </w:rPr>
-        <w:t>3.1 雲端模式</w:t>
+        <w:t>8.1 重複判斷</w:t>
+      </w:r>
+    </w:p>
+    <w:p>
+      <w:r>
+        <w:rPr>
+          <w:sz w:val="21"/>
+        </w:rPr>
+        <w:t>匯入資料沒有時間時，名稱＋日期＋標準化城市＋標準化地點相同即視為重複；有時間時，還要開始時間相同才視為重複。master_url 不作為重複條件。城市會先正規化，例如臺北市／台北／Taipei City 統一比較。</w:t>
+      </w:r>
+    </w:p>
+    <w:p>
+      <w:pPr>
+        <w:pStyle w:val="Heading1"/>
+      </w:pPr>
+      <w:r>
+        <w:rPr>
+          <w:sz w:val="21"/>
+        </w:rPr>
+        <w:t>9. 推薦景點</w:t>
       </w:r>
     </w:p>
     <w:p>
       <w:pPr>
         <w:pStyle w:val="ListBullet"/>
-        <w:spacing w:after="60"/>
       </w:pPr>
       <w:r>
         <w:rPr>
-          <w:rFonts w:ascii="Aptos" w:hAnsi="Aptos" w:eastAsia="Microsoft JhengHei"/>
+          <w:sz w:val="21"/>
         </w:rPr>
-        <w:t>資料保存在雲端，可於其他已登入相同帳號的裝置查看。</w:t>
+        <w:t>支援城市、關鍵字與清單／地圖切換；排序依喜歡狀態，再依城市、地點、名稱。</w:t>
       </w:r>
     </w:p>
     <w:p>
       <w:pPr>
         <w:pStyle w:val="ListBullet"/>
-        <w:spacing w:after="60"/>
       </w:pPr>
       <w:r>
         <w:rPr>
-          <w:rFonts w:ascii="Aptos" w:hAnsi="Aptos" w:eastAsia="Microsoft JhengHei"/>
+          <w:sz w:val="21"/>
         </w:rPr>
-        <w:t>受目前方案額度限制。</w:t>
+        <w:t>顯示營業時間；圖片只有存在時才占版面。</w:t>
       </w:r>
     </w:p>
     <w:p>
       <w:pPr>
         <w:pStyle w:val="ListBullet"/>
-        <w:spacing w:after="60"/>
       </w:pPr>
       <w:r>
         <w:rPr>
-          <w:rFonts w:ascii="Aptos" w:hAnsi="Aptos" w:eastAsia="Microsoft JhengHei"/>
+          <w:sz w:val="21"/>
         </w:rPr>
-        <w:t>行事曆分享只能在雲端模式使用。</w:t>
+        <w:t>地圖總覽以國家與城市彙總數量，點城市名稱或數字都會切回該城市清單。</w:t>
+      </w:r>
+    </w:p>
+    <w:p>
+      <w:pPr>
+        <w:pStyle w:val="ListBullet"/>
+      </w:pPr>
+      <w:r>
+        <w:rPr>
+          <w:sz w:val="21"/>
+        </w:rPr>
+        <w:t>資料庫的 lat／lng 可能只是天氣鄰近座標；專用 map_lat／map_lng 存在時優先使用，避免把標記放錯縣市。</w:t>
+      </w:r>
+    </w:p>
+    <w:p>
+      <w:pPr>
+        <w:pStyle w:val="Heading1"/>
+      </w:pPr>
+      <w:r>
+        <w:rPr>
+          <w:sz w:val="21"/>
+        </w:rPr>
+        <w:t>10. 回憶走廊</w:t>
+      </w:r>
+    </w:p>
+    <w:p>
+      <w:pPr>
+        <w:pStyle w:val="ListNumber"/>
+      </w:pPr>
+      <w:r>
+        <w:rPr>
+          <w:sz w:val="21"/>
+        </w:rPr>
+        <w:t>新增回憶，可輸入標題、日期、城市、地點、描述與選擇性圖片；未來日期也可保存並顯示。</w:t>
+      </w:r>
+    </w:p>
+    <w:p>
+      <w:pPr>
+        <w:pStyle w:val="ListNumber"/>
+      </w:pPr>
+      <w:r>
+        <w:rPr>
+          <w:sz w:val="21"/>
+        </w:rPr>
+        <w:t>預設載入近 30 天；按「載入更多」每次向前 30 天。若近 30 天無資料，先顯示最新一筆。</w:t>
+      </w:r>
+    </w:p>
+    <w:p>
+      <w:pPr>
+        <w:pStyle w:val="ListNumber"/>
+      </w:pPr>
+      <w:r>
+        <w:rPr>
+          <w:sz w:val="21"/>
+        </w:rPr>
+        <w:t>可切換清單與城市地圖；點城市會篩選並回到清單。</w:t>
+      </w:r>
+    </w:p>
+    <w:p>
+      <w:pPr>
+        <w:pStyle w:val="ListNumber"/>
+      </w:pPr>
+      <w:r>
+        <w:rPr>
+          <w:sz w:val="21"/>
+        </w:rPr>
+        <w:t>雲端／本機搬移後，使用量應依目前模式重算；持續轉圈時先確認登入模式與瀏覽器網站資料未被清除。</w:t>
+      </w:r>
+    </w:p>
+    <w:p>
+      <w:pPr>
+        <w:pStyle w:val="Heading1"/>
+      </w:pPr>
+      <w:r>
+        <w:rPr>
+          <w:sz w:val="21"/>
+        </w:rPr>
+        <w:t>11. 遊戲與自建題庫</w:t>
+      </w:r>
+    </w:p>
+    <w:p>
+      <w:r>
+        <w:rPr>
+          <w:sz w:val="21"/>
+        </w:rPr>
+        <w:t>遊戲包含 Mario Translation、English RPG Adventure、Speaking、Translation、Translation日、Translation韓、Word and sentence builder、Word Searching、Social 與多種 STEAM 遊戲。股票與 Business Plan 僅管理者可用。</w:t>
+      </w:r>
+    </w:p>
+    <w:p>
+      <w:pPr>
+        <w:pStyle w:val="ListNumber"/>
+      </w:pPr>
+      <w:r>
+        <w:rPr>
+          <w:sz w:val="21"/>
+        </w:rPr>
+        <w:t>在遊戲頁選擇管理者題庫或我的題庫。一般使用者尚未選「我的題庫」前，不顯示新增／管理按鈕。</w:t>
+      </w:r>
+    </w:p>
+    <w:p>
+      <w:pPr>
+        <w:pStyle w:val="ListNumber"/>
+      </w:pPr>
+      <w:r>
+        <w:rPr>
+          <w:sz w:val="21"/>
+        </w:rPr>
+        <w:t>新增題目時先選分類；畫面從管理者題庫隨機顯示完整句子範例，開始輸入後提示不消失。</w:t>
+      </w:r>
+    </w:p>
+    <w:p>
+      <w:pPr>
+        <w:pStyle w:val="ListNumber"/>
+      </w:pPr>
+      <w:r>
+        <w:rPr>
+          <w:sz w:val="21"/>
+        </w:rPr>
+        <w:t>English RPG Adventure 的 grammar 類輸入完整句子與答案，系統產生挖空，不要求輸入底線；plural 範例不顯示 &lt;-&gt;。</w:t>
+      </w:r>
+    </w:p>
+    <w:p>
+      <w:pPr>
+        <w:pStyle w:val="ListNumber"/>
+      </w:pPr>
+      <w:r>
+        <w:rPr>
+          <w:sz w:val="21"/>
+        </w:rPr>
+        <w:t>Speaking 與 Word and sentence builder 共用句子／單字來源，新增與編輯規則一致。</w:t>
+      </w:r>
+    </w:p>
+    <w:p>
+      <w:pPr>
+        <w:pStyle w:val="ListNumber"/>
+      </w:pPr>
+      <w:r>
+        <w:rPr>
+          <w:sz w:val="21"/>
+        </w:rPr>
+        <w:t>日／韓翻譯一般使用者只能沿用既有中文分類前綴，尾端最多 3 位數自動轉 level；管理者可自建分類。</w:t>
+      </w:r>
+    </w:p>
+    <w:p>
+      <w:pPr>
+        <w:pStyle w:val="ListNumber"/>
+      </w:pPr>
+      <w:r>
+        <w:rPr>
+          <w:sz w:val="21"/>
+        </w:rPr>
+        <w:t>Social 題目輸入標題、情境描述、3 個答案選項、分數及回饋；選項標示為「答案選項」而非「正確答案」。</w:t>
+      </w:r>
+    </w:p>
+    <w:p>
+      <w:pPr>
+        <w:pStyle w:val="ListNumber"/>
+      </w:pPr>
+      <w:r>
+        <w:rPr>
+          <w:sz w:val="21"/>
+        </w:rPr>
+        <w:t>儲存前會在同一來源／擁有者／分類內正規化比對重複題目；重複時提示而不新增。</w:t>
+      </w:r>
+    </w:p>
+    <w:p>
+      <w:pPr>
+        <w:pStyle w:val="ListNumber"/>
+      </w:pPr>
+      <w:r>
+        <w:rPr>
+          <w:sz w:val="21"/>
+        </w:rPr>
+        <w:t>我的題目可搜尋、分類、篩選啟用狀態、編輯、停用／啟用與刪除。已有答題紀錄而不能刪除時，顯示可理解訊息並可改用停用。</w:t>
+      </w:r>
+    </w:p>
+    <w:tbl>
+      <w:tblPr>
+        <w:tblW w:type="auto" w:w="0"/>
+        <w:jc w:val="center"/>
+        <w:tblLook w:firstColumn="1" w:firstRow="1" w:lastColumn="0" w:lastRow="0" w:noHBand="0" w:noVBand="1" w:val="04A0"/>
+      </w:tblPr>
+      <w:tblGrid>
+        <w:gridCol w:w="9972"/>
+      </w:tblGrid>
+      <w:tr>
+        <w:tc>
+          <w:tcPr>
+            <w:tcW w:type="dxa" w:w="9972"/>
+            <w:shd w:fill="E8F3F6"/>
+          </w:tcPr>
+          <w:p>
+            <w:r>
+              <w:rPr>
+                <w:b/>
+              </w:rPr>
+              <w:t>離開遊戲：</w:t>
+            </w:r>
+            <w:r>
+              <w:t>按返回箭頭或手機由左向右滑時會再次確認；Mario 分數降至 -20 結束時仍保留返回上一頁入口。</w:t>
+            </w:r>
+          </w:p>
+        </w:tc>
+      </w:tr>
+    </w:tbl>
+    <w:p/>
+    <w:p>
+      <w:pPr>
+        <w:pStyle w:val="Heading1"/>
+      </w:pPr>
+      <w:r>
+        <w:rPr>
+          <w:sz w:val="21"/>
+        </w:rPr>
+        <w:t>12. 股票、Business Plan、意見回饋</w:t>
       </w:r>
     </w:p>
     <w:p>
@@ -406,81 +2149,17 @@
       </w:pPr>
       <w:r>
         <w:rPr>
-          <w:rFonts w:ascii="Aptos" w:hAnsi="Aptos" w:eastAsia="Microsoft JhengHei"/>
+          <w:sz w:val="21"/>
         </w:rPr>
-        <w:t>3.2 此裝置模式</w:t>
+        <w:t>12.1 股票（管理者）</w:t>
       </w:r>
     </w:p>
     <w:p>
-      <w:pPr>
-        <w:pStyle w:val="ListBullet"/>
-        <w:spacing w:after="60"/>
-      </w:pPr>
       <w:r>
         <w:rPr>
-          <w:rFonts w:ascii="Aptos" w:hAnsi="Aptos" w:eastAsia="Microsoft JhengHei"/>
+          <w:sz w:val="21"/>
         </w:rPr>
-        <w:t>資料保存在目前手機、平板、電腦或瀏覽器。</w:t>
-      </w:r>
-    </w:p>
-    <w:p>
-      <w:pPr>
-        <w:pStyle w:val="ListBullet"/>
-        <w:spacing w:after="60"/>
-      </w:pPr>
-      <w:r>
-        <w:rPr>
-          <w:rFonts w:ascii="Aptos" w:hAnsi="Aptos" w:eastAsia="Microsoft JhengHei"/>
-        </w:rPr>
-        <w:t>本機資料不限筆數且不會由系統主動刪除。</w:t>
-      </w:r>
-    </w:p>
-    <w:p>
-      <w:pPr>
-        <w:pStyle w:val="ListBullet"/>
-        <w:spacing w:after="60"/>
-      </w:pPr>
-      <w:r>
-        <w:rPr>
-          <w:rFonts w:ascii="Aptos" w:hAnsi="Aptos" w:eastAsia="Microsoft JhengHei"/>
-        </w:rPr>
-        <w:t>不會自動同步到其他裝置。</w:t>
-      </w:r>
-    </w:p>
-    <w:p>
-      <w:pPr>
-        <w:pStyle w:val="ListBullet"/>
-        <w:spacing w:after="60"/>
-      </w:pPr>
-      <w:r>
-        <w:rPr>
-          <w:rFonts w:ascii="Aptos" w:hAnsi="Aptos" w:eastAsia="Microsoft JhengHei"/>
-        </w:rPr>
-        <w:t>Web 版資料位於該網站的瀏覽器 IndexedDB；清除網站資料、清除瀏覽器資料或更換瀏覽器後，資料不會自動出現。</w:t>
-      </w:r>
-    </w:p>
-    <w:p>
-      <w:pPr>
-        <w:pStyle w:val="ListBullet"/>
-        <w:spacing w:after="60"/>
-      </w:pPr>
-      <w:r>
-        <w:rPr>
-          <w:rFonts w:ascii="Aptos" w:hAnsi="Aptos" w:eastAsia="Microsoft JhengHei"/>
-        </w:rPr>
-        <w:t>建議定期使用資料匯出功能保存副本。</w:t>
-      </w:r>
-    </w:p>
-    <w:p>
-      <w:pPr>
-        <w:pStyle w:val="ListBullet"/>
-        <w:spacing w:after="60"/>
-      </w:pPr>
-      <w:r>
-        <w:rPr>
-          <w:rFonts w:ascii="Aptos" w:hAnsi="Aptos" w:eastAsia="Microsoft JhengHei"/>
-        </w:rPr>
-        <w:t>此裝置模式無法使用行事曆分享。</w:t>
+        <w:t>初始載入或背景更新進行中不能選日期；更新完成或失敗後可選不晚於資料庫最新日期的歷史日期。私人 Mac API 關機時仍應回退 Supabase；歷史表不存在時應顯示可重選日期，而不是反覆跳回最新日期。</w:t>
       </w:r>
     </w:p>
     <w:p>
@@ -489,73 +2168,36 @@
       </w:pPr>
       <w:r>
         <w:rPr>
-          <w:rFonts w:ascii="Aptos" w:hAnsi="Aptos" w:eastAsia="Microsoft JhengHei"/>
+          <w:sz w:val="21"/>
         </w:rPr>
-        <w:t>3.3 切換資料位置</w:t>
+        <w:t>12.2 Business Plan（管理者）</w:t>
       </w:r>
     </w:p>
     <w:p>
       <w:r>
         <w:rPr>
-          <w:rFonts w:ascii="Aptos" w:hAnsi="Aptos" w:eastAsia="Microsoft JhengHei"/>
+          <w:sz w:val="21"/>
         </w:rPr>
-        <w:t>設定位置位於使用者選單中的服務條款與資料匯出之間。</w:t>
+        <w:t>可依進行中、尚未開始、已完成篩選；預設顯示前兩者，依狀態與建立時間排序。載入更多每次向前 360 天。</w:t>
       </w:r>
     </w:p>
     <w:p>
       <w:pPr>
-        <w:pStyle w:val="ListBullet"/>
-        <w:spacing w:after="60"/>
+        <w:pStyle w:val="Heading2"/>
       </w:pPr>
       <w:r>
         <w:rPr>
-          <w:rFonts w:ascii="Aptos" w:hAnsi="Aptos" w:eastAsia="Microsoft JhengHei"/>
+          <w:sz w:val="21"/>
         </w:rPr>
-        <w:t>雲端轉此裝置：先把雲端資料完整寫入此裝置，確認成功後才刪除雲端資料。</w:t>
-      </w:r>
-    </w:p>
-    <w:p>
-      <w:pPr>
-        <w:pStyle w:val="ListBullet"/>
-        <w:spacing w:after="60"/>
-      </w:pPr>
-      <w:r>
-        <w:rPr>
-          <w:rFonts w:ascii="Aptos" w:hAnsi="Aptos" w:eastAsia="Microsoft JhengHei"/>
-        </w:rPr>
-        <w:t>此裝置轉雲端：先檢查雲端額度；任一項超過額度時整批取消，不會只上傳部分資料。</w:t>
-      </w:r>
-    </w:p>
-    <w:p>
-      <w:pPr>
-        <w:pStyle w:val="ListBullet"/>
-        <w:spacing w:after="60"/>
-      </w:pPr>
-      <w:r>
-        <w:rPr>
-          <w:rFonts w:ascii="Aptos" w:hAnsi="Aptos" w:eastAsia="Microsoft JhengHei"/>
-        </w:rPr>
-        <w:t>切換成功後，來源端資料會刪除，雲端與此裝置不會同時作為主要資料來源。</w:t>
-      </w:r>
-    </w:p>
-    <w:p>
-      <w:pPr>
-        <w:pStyle w:val="ListBullet"/>
-        <w:spacing w:after="60"/>
-      </w:pPr>
-      <w:r>
-        <w:rPr>
-          <w:rFonts w:ascii="Aptos" w:hAnsi="Aptos" w:eastAsia="Microsoft JhengHei"/>
-        </w:rPr>
-        <w:t>搬移失敗的資料會保留在原位置，並顯示失敗原因。</w:t>
+        <w:t>12.3 意見回饋</w:t>
       </w:r>
     </w:p>
     <w:p>
       <w:r>
         <w:rPr>
-          <w:rFonts w:ascii="Aptos" w:hAnsi="Aptos" w:eastAsia="Microsoft JhengHei"/>
+          <w:sz w:val="21"/>
         </w:rPr>
-        <w:t>切換前請確認目前裝置空間足夠、網路穩定，且不要關閉頁面。</w:t>
+        <w:t>一般使用者建立並查看自己的議題；管理者查看與處理全部。預設顯示處理中及未處理，載入更多每次向前 30 天。多張圖片在開啟時載入。</w:t>
       </w:r>
     </w:p>
     <w:p>
@@ -564,77 +2206,323 @@
       </w:pPr>
       <w:r>
         <w:rPr>
-          <w:rFonts w:ascii="Aptos" w:hAnsi="Aptos" w:eastAsia="Microsoft JhengHei"/>
+          <w:sz w:val="21"/>
         </w:rPr>
-        <w:t>4. 方案與額度</w:t>
+        <w:t>13. 常見問題快速排除</w:t>
       </w:r>
     </w:p>
-    <w:p>
-      <w:r>
-        <w:rPr>
-          <w:rFonts w:ascii="Aptos" w:hAnsi="Aptos" w:eastAsia="Microsoft JhengHei"/>
-        </w:rPr>
-        <w:t>使用者選單的「方案與訂閱」可查看：</w:t>
-      </w:r>
-    </w:p>
+    <w:tbl>
+      <w:tblPr>
+        <w:tblStyle w:val="TableGrid"/>
+        <w:tblW w:type="auto" w:w="0"/>
+        <w:jc w:val="center"/>
+        <w:tblLook w:firstColumn="1" w:firstRow="1" w:lastColumn="0" w:lastRow="0" w:noHBand="0" w:noVBand="1" w:val="04A0"/>
+      </w:tblPr>
+      <w:tblGrid>
+        <w:gridCol w:w="3324"/>
+        <w:gridCol w:w="3324"/>
+        <w:gridCol w:w="3324"/>
+      </w:tblGrid>
+      <w:tr>
+        <w:tc>
+          <w:tcPr>
+            <w:tcW w:type="dxa" w:w="3324"/>
+            <w:shd w:fill="DDEBF2"/>
+          </w:tcPr>
+          <w:p>
+            <w:r>
+              <w:rPr>
+                <w:b/>
+              </w:rPr>
+              <w:t>現象</w:t>
+            </w:r>
+          </w:p>
+        </w:tc>
+        <w:tc>
+          <w:tcPr>
+            <w:tcW w:type="dxa" w:w="3324"/>
+            <w:shd w:fill="DDEBF2"/>
+          </w:tcPr>
+          <w:p>
+            <w:r>
+              <w:rPr>
+                <w:b/>
+              </w:rPr>
+              <w:t>先檢查</w:t>
+            </w:r>
+          </w:p>
+        </w:tc>
+        <w:tc>
+          <w:tcPr>
+            <w:tcW w:type="dxa" w:w="3324"/>
+            <w:shd w:fill="DDEBF2"/>
+          </w:tcPr>
+          <w:p>
+            <w:r>
+              <w:rPr>
+                <w:b/>
+              </w:rPr>
+              <w:t>處理方式</w:t>
+            </w:r>
+          </w:p>
+        </w:tc>
+      </w:tr>
+      <w:tr>
+        <w:tc>
+          <w:tcPr>
+            <w:tcW w:type="dxa" w:w="3324"/>
+            <w:vAlign w:val="top"/>
+          </w:tcPr>
+          <w:p>
+            <w:r>
+              <w:t>一直轉圈</w:t>
+            </w:r>
+          </w:p>
+        </w:tc>
+        <w:tc>
+          <w:tcPr>
+            <w:tcW w:type="dxa" w:w="3324"/>
+            <w:vAlign w:val="top"/>
+          </w:tcPr>
+          <w:p>
+            <w:r>
+              <w:t>網路、目前資料模式、是否剛搬移</w:t>
+            </w:r>
+          </w:p>
+        </w:tc>
+        <w:tc>
+          <w:tcPr>
+            <w:tcW w:type="dxa" w:w="3324"/>
+            <w:vAlign w:val="top"/>
+          </w:tcPr>
+          <w:p>
+            <w:r>
+              <w:t>返回再進入；確認 IndexedDB；保留錯誤訊息</w:t>
+            </w:r>
+          </w:p>
+        </w:tc>
+      </w:tr>
+      <w:tr>
+        <w:tc>
+          <w:tcPr>
+            <w:tcW w:type="dxa" w:w="3324"/>
+            <w:vAlign w:val="top"/>
+          </w:tcPr>
+          <w:p>
+            <w:r>
+              <w:t>超額只顯示儲存失敗</w:t>
+            </w:r>
+          </w:p>
+        </w:tc>
+        <w:tc>
+          <w:tcPr>
+            <w:tcW w:type="dxa" w:w="3324"/>
+            <w:vAlign w:val="top"/>
+          </w:tcPr>
+          <w:p>
+            <w:r>
+              <w:t>方案頁的使用量與額度</w:t>
+            </w:r>
+          </w:p>
+        </w:tc>
+        <w:tc>
+          <w:tcPr>
+            <w:tcW w:type="dxa" w:w="3324"/>
+            <w:vAlign w:val="top"/>
+          </w:tcPr>
+          <w:p>
+            <w:r>
+              <w:t>刪除舊資料、訂閱或搬到此裝置</w:t>
+            </w:r>
+          </w:p>
+        </w:tc>
+      </w:tr>
+      <w:tr>
+        <w:tc>
+          <w:tcPr>
+            <w:tcW w:type="dxa" w:w="3324"/>
+            <w:vAlign w:val="top"/>
+          </w:tcPr>
+          <w:p>
+            <w:r>
+              <w:t>本機資料不見</w:t>
+            </w:r>
+          </w:p>
+        </w:tc>
+        <w:tc>
+          <w:tcPr>
+            <w:tcW w:type="dxa" w:w="3324"/>
+            <w:vAlign w:val="top"/>
+          </w:tcPr>
+          <w:p>
+            <w:r>
+              <w:t>是否換瀏覽器／清除網站資料</w:t>
+            </w:r>
+          </w:p>
+        </w:tc>
+        <w:tc>
+          <w:tcPr>
+            <w:tcW w:type="dxa" w:w="3324"/>
+            <w:vAlign w:val="top"/>
+          </w:tcPr>
+          <w:p>
+            <w:r>
+              <w:t>回到原裝置與原瀏覽器；由匯出檔恢復</w:t>
+            </w:r>
+          </w:p>
+        </w:tc>
+      </w:tr>
+      <w:tr>
+        <w:tc>
+          <w:tcPr>
+            <w:tcW w:type="dxa" w:w="3324"/>
+            <w:vAlign w:val="top"/>
+          </w:tcPr>
+          <w:p>
+            <w:r>
+              <w:t>共享事件不能改</w:t>
+            </w:r>
+          </w:p>
+        </w:tc>
+        <w:tc>
+          <w:tcPr>
+            <w:tcW w:type="dxa" w:w="3324"/>
+            <w:vAlign w:val="top"/>
+          </w:tcPr>
+          <w:p>
+            <w:r>
+              <w:t>事件顏色與擁有者</w:t>
+            </w:r>
+          </w:p>
+        </w:tc>
+        <w:tc>
+          <w:tcPr>
+            <w:tcW w:type="dxa" w:w="3324"/>
+            <w:vAlign w:val="top"/>
+          </w:tcPr>
+          <w:p>
+            <w:r>
+              <w:t>這是預期唯讀；請分享者修改</w:t>
+            </w:r>
+          </w:p>
+        </w:tc>
+      </w:tr>
+      <w:tr>
+        <w:tc>
+          <w:tcPr>
+            <w:tcW w:type="dxa" w:w="3324"/>
+            <w:vAlign w:val="top"/>
+          </w:tcPr>
+          <w:p>
+            <w:r>
+              <w:t>地圖城市不準</w:t>
+            </w:r>
+          </w:p>
+        </w:tc>
+        <w:tc>
+          <w:tcPr>
+            <w:tcW w:type="dxa" w:w="3324"/>
+            <w:vAlign w:val="top"/>
+          </w:tcPr>
+          <w:p>
+            <w:r>
+              <w:t>country、city、map_lat、map_lng</w:t>
+            </w:r>
+          </w:p>
+        </w:tc>
+        <w:tc>
+          <w:tcPr>
+            <w:tcW w:type="dxa" w:w="3324"/>
+            <w:vAlign w:val="top"/>
+          </w:tcPr>
+          <w:p>
+            <w:r>
+              <w:t>先用城市清單；管理者補回專用座標</w:t>
+            </w:r>
+          </w:p>
+        </w:tc>
+      </w:tr>
+      <w:tr>
+        <w:tc>
+          <w:tcPr>
+            <w:tcW w:type="dxa" w:w="3324"/>
+            <w:vAlign w:val="top"/>
+          </w:tcPr>
+          <w:p>
+            <w:r>
+              <w:t>載入更多一直存在</w:t>
+            </w:r>
+          </w:p>
+        </w:tc>
+        <w:tc>
+          <w:tcPr>
+            <w:tcW w:type="dxa" w:w="3324"/>
+            <w:vAlign w:val="top"/>
+          </w:tcPr>
+          <w:p>
+            <w:r>
+              <w:t>是否真的有更舊資料</w:t>
+            </w:r>
+          </w:p>
+        </w:tc>
+        <w:tc>
+          <w:tcPr>
+            <w:tcW w:type="dxa" w:w="3324"/>
+            <w:vAlign w:val="top"/>
+          </w:tcPr>
+          <w:p>
+            <w:r>
+              <w:t>新版在一次空結果後應隱藏；記錄畫面與日期回報</w:t>
+            </w:r>
+          </w:p>
+        </w:tc>
+      </w:tr>
+      <w:tr>
+        <w:tc>
+          <w:tcPr>
+            <w:tcW w:type="dxa" w:w="3324"/>
+            <w:vAlign w:val="top"/>
+          </w:tcPr>
+          <w:p>
+            <w:r>
+              <w:t>手機啟動慢</w:t>
+            </w:r>
+          </w:p>
+        </w:tc>
+        <w:tc>
+          <w:tcPr>
+            <w:tcW w:type="dxa" w:w="3324"/>
+            <w:vAlign w:val="top"/>
+          </w:tcPr>
+          <w:p>
+            <w:r>
+              <w:t>首次啟動、網路、通知／時區權限</w:t>
+            </w:r>
+          </w:p>
+        </w:tc>
+        <w:tc>
+          <w:tcPr>
+            <w:tcW w:type="dxa" w:w="3324"/>
+            <w:vAlign w:val="top"/>
+          </w:tcPr>
+          <w:p>
+            <w:r>
+              <w:t>更新 App；第二次測試；記錄從點圖示到登入／首頁秒數</w:t>
+            </w:r>
+          </w:p>
+        </w:tc>
+      </w:tr>
+    </w:tbl>
+    <w:p/>
     <w:p>
       <w:pPr>
-        <w:pStyle w:val="ListBullet"/>
-        <w:spacing w:after="60"/>
+        <w:pStyle w:val="Heading1"/>
       </w:pPr>
       <w:r>
         <w:rPr>
-          <w:rFonts w:ascii="Aptos" w:hAnsi="Aptos" w:eastAsia="Microsoft JhengHei"/>
+          <w:sz w:val="21"/>
         </w:rPr>
-        <w:t>目前方案與有效期限。</w:t>
-      </w:r>
-    </w:p>
-    <w:p>
-      <w:pPr>
-        <w:pStyle w:val="ListBullet"/>
-        <w:spacing w:after="60"/>
-      </w:pPr>
-      <w:r>
-        <w:rPr>
-          <w:rFonts w:ascii="Aptos" w:hAnsi="Aptos" w:eastAsia="Microsoft JhengHei"/>
-        </w:rPr>
-        <w:t>每一筆仍有效的舊版／新版權益。</w:t>
-      </w:r>
-    </w:p>
-    <w:p>
-      <w:pPr>
-        <w:pStyle w:val="ListBullet"/>
-        <w:spacing w:after="60"/>
-      </w:pPr>
-      <w:r>
-        <w:rPr>
-          <w:rFonts w:ascii="Aptos" w:hAnsi="Aptos" w:eastAsia="Microsoft JhengHei"/>
-        </w:rPr>
-        <w:t>版本生效日、付款金額、倍率及到期日。</w:t>
-      </w:r>
-    </w:p>
-    <w:p>
-      <w:pPr>
-        <w:pStyle w:val="ListBullet"/>
-        <w:spacing w:after="60"/>
-      </w:pPr>
-      <w:r>
-        <w:rPr>
-          <w:rFonts w:ascii="Aptos" w:hAnsi="Aptos" w:eastAsia="Microsoft JhengHei"/>
-        </w:rPr>
-        <w:t>各項已使用量與合計可用額度。</w:t>
-      </w:r>
-    </w:p>
-    <w:p>
-      <w:pPr>
-        <w:pStyle w:val="ListBullet"/>
-        <w:spacing w:after="60"/>
-      </w:pPr>
-      <w:r>
-        <w:rPr>
-          <w:rFonts w:ascii="Aptos" w:hAnsi="Aptos" w:eastAsia="Microsoft JhengHei"/>
-        </w:rPr>
-        <w:t>下一次付款適用的最新方案版本。</w:t>
+        <w:t>14. 方案與本機遊戲題庫</w:t>
       </w:r>
     </w:p>
     <w:p>
@@ -643,113 +2531,205 @@
       </w:pPr>
       <w:r>
         <w:rPr>
-          <w:rFonts w:ascii="Aptos" w:hAnsi="Aptos" w:eastAsia="Microsoft JhengHei"/>
+          <w:sz w:val="21"/>
         </w:rPr>
-        <w:t>4.1 免費雲端版</w:t>
-      </w:r>
-    </w:p>
-    <w:p>
-      <w:pPr>
-        <w:pStyle w:val="ListBullet"/>
-        <w:spacing w:after="60"/>
-      </w:pPr>
-      <w:r>
-        <w:rPr>
-          <w:rFonts w:ascii="Aptos" w:hAnsi="Aptos" w:eastAsia="Microsoft JhengHei"/>
-        </w:rPr>
-        <w:t>行事曆：30 筆。</w:t>
-      </w:r>
-    </w:p>
-    <w:p>
-      <w:pPr>
-        <w:pStyle w:val="ListBullet"/>
-        <w:spacing w:after="60"/>
-      </w:pPr>
-      <w:r>
-        <w:rPr>
-          <w:rFonts w:ascii="Aptos" w:hAnsi="Aptos" w:eastAsia="Microsoft JhengHei"/>
-        </w:rPr>
-        <w:t>記帳明細：30 筆。</w:t>
-      </w:r>
-    </w:p>
-    <w:p>
-      <w:pPr>
-        <w:pStyle w:val="ListBullet"/>
-        <w:spacing w:after="60"/>
-      </w:pPr>
-      <w:r>
-        <w:rPr>
-          <w:rFonts w:ascii="Aptos" w:hAnsi="Aptos" w:eastAsia="Microsoft JhengHei"/>
-        </w:rPr>
-        <w:t>積分明細：30 筆。</w:t>
-      </w:r>
-    </w:p>
-    <w:p>
-      <w:pPr>
-        <w:pStyle w:val="ListBullet"/>
-        <w:spacing w:after="60"/>
-      </w:pPr>
-      <w:r>
-        <w:rPr>
-          <w:rFonts w:ascii="Aptos" w:hAnsi="Aptos" w:eastAsia="Microsoft JhengHei"/>
-        </w:rPr>
-        <w:t>回憶：30 筆。</w:t>
-      </w:r>
-    </w:p>
-    <w:p>
-      <w:pPr>
-        <w:pStyle w:val="ListBullet"/>
-        <w:spacing w:after="60"/>
-      </w:pPr>
-      <w:r>
-        <w:rPr>
-          <w:rFonts w:ascii="Aptos" w:hAnsi="Aptos" w:eastAsia="Microsoft JhengHei"/>
-        </w:rPr>
-        <w:t>自建遊戲題目：50 題。</w:t>
-      </w:r>
-    </w:p>
-    <w:p>
-      <w:pPr>
-        <w:pStyle w:val="ListBullet"/>
-        <w:spacing w:after="60"/>
-      </w:pPr>
-      <w:r>
-        <w:rPr>
-          <w:rFonts w:ascii="Aptos" w:hAnsi="Aptos" w:eastAsia="Microsoft JhengHei"/>
-        </w:rPr>
-        <w:t>行事曆分享：最多 2 人。</w:t>
-      </w:r>
-    </w:p>
-    <w:p>
-      <w:pPr>
-        <w:pStyle w:val="ListBullet"/>
-        <w:spacing w:after="60"/>
-      </w:pPr>
-      <w:r>
-        <w:rPr>
-          <w:rFonts w:ascii="Aptos" w:hAnsi="Aptos" w:eastAsia="Microsoft JhengHei"/>
-        </w:rPr>
-        <w:t>不提供雲端圖片上傳。</w:t>
-      </w:r>
-    </w:p>
-    <w:p>
-      <w:pPr>
-        <w:pStyle w:val="ListBullet"/>
-        <w:spacing w:after="60"/>
-      </w:pPr>
-      <w:r>
-        <w:rPr>
-          <w:rFonts w:ascii="Aptos" w:hAnsi="Aptos" w:eastAsia="Microsoft JhengHei"/>
-        </w:rPr>
-        <w:t>雲端詳細答題紀錄保留最近 30 天。</w:t>
+        <w:t>14.1 方案顯示順序</w:t>
       </w:r>
     </w:p>
     <w:p>
       <w:r>
         <w:rPr>
-          <w:rFonts w:ascii="Aptos" w:hAnsi="Aptos" w:eastAsia="Microsoft JhengHei"/>
+          <w:sz w:val="21"/>
         </w:rPr>
-        <w:t>免費帳號連續 3 個月沒有新增或修改資料，會被視為無效帳號並由系統清理。請在需要保留資料時登入並更新資料，或先搬到此裝置／匯出。</w:t>
+        <w:t>方案與訂閱頁會先顯示目前正在使用的方案與實際額度。其餘方案依價格由低到高排列。雲端 Plus 使用者會先看到雲端 Plus；只有使用本機 Plus 時，本機 Plus 才會排在最前面。</w:t>
+      </w:r>
+    </w:p>
+    <w:tbl>
+      <w:tblPr>
+        <w:tblStyle w:val="TableGrid"/>
+        <w:tblW w:type="auto" w:w="0"/>
+        <w:tblLook w:firstColumn="1" w:firstRow="1" w:lastColumn="0" w:lastRow="0" w:noHBand="0" w:noVBand="1" w:val="04A0"/>
+      </w:tblPr>
+      <w:tblGrid>
+        <w:gridCol w:w="3324"/>
+        <w:gridCol w:w="3324"/>
+        <w:gridCol w:w="3324"/>
+      </w:tblGrid>
+      <w:tr>
+        <w:tc>
+          <w:tcPr>
+            <w:tcW w:type="dxa" w:w="3324"/>
+            <w:vAlign w:val="center"/>
+          </w:tcPr>
+          <w:p>
+            <w:r>
+              <w:rPr>
+                <w:b/>
+              </w:rPr>
+              <w:t>方案</w:t>
+            </w:r>
+          </w:p>
+        </w:tc>
+        <w:tc>
+          <w:tcPr>
+            <w:tcW w:type="dxa" w:w="3324"/>
+            <w:vAlign w:val="center"/>
+          </w:tcPr>
+          <w:p>
+            <w:r>
+              <w:rPr>
+                <w:b/>
+              </w:rPr>
+              <w:t>資料位置</w:t>
+            </w:r>
+          </w:p>
+        </w:tc>
+        <w:tc>
+          <w:tcPr>
+            <w:tcW w:type="dxa" w:w="3324"/>
+            <w:vAlign w:val="center"/>
+          </w:tcPr>
+          <w:p>
+            <w:r>
+              <w:rPr>
+                <w:b/>
+              </w:rPr>
+              <w:t>使用方式</w:t>
+            </w:r>
+          </w:p>
+        </w:tc>
+      </w:tr>
+      <w:tr>
+        <w:tc>
+          <w:tcPr>
+            <w:tcW w:type="dxa" w:w="3324"/>
+            <w:vAlign w:val="center"/>
+          </w:tcPr>
+          <w:p>
+            <w:r>
+              <w:t>雲端免費版</w:t>
+            </w:r>
+          </w:p>
+        </w:tc>
+        <w:tc>
+          <w:tcPr>
+            <w:tcW w:type="dxa" w:w="3324"/>
+            <w:vAlign w:val="center"/>
+          </w:tcPr>
+          <w:p>
+            <w:r>
+              <w:t>雲端</w:t>
+            </w:r>
+          </w:p>
+        </w:tc>
+        <w:tc>
+          <w:tcPr>
+            <w:tcW w:type="dxa" w:w="3324"/>
+            <w:vAlign w:val="center"/>
+          </w:tcPr>
+          <w:p>
+            <w:r>
+              <w:t>依免費額度保存，可跨裝置登入查看；不包含雲端圖片上傳。</w:t>
+            </w:r>
+          </w:p>
+        </w:tc>
+      </w:tr>
+      <w:tr>
+        <w:tc>
+          <w:tcPr>
+            <w:tcW w:type="dxa" w:w="3324"/>
+            <w:vAlign w:val="center"/>
+          </w:tcPr>
+          <w:p>
+            <w:r>
+              <w:t>雲端 Plus</w:t>
+            </w:r>
+          </w:p>
+        </w:tc>
+        <w:tc>
+          <w:tcPr>
+            <w:tcW w:type="dxa" w:w="3324"/>
+            <w:vAlign w:val="center"/>
+          </w:tcPr>
+          <w:p>
+            <w:r>
+              <w:t>雲端</w:t>
+            </w:r>
+          </w:p>
+        </w:tc>
+        <w:tc>
+          <w:tcPr>
+            <w:tcW w:type="dxa" w:w="3324"/>
+            <w:vAlign w:val="center"/>
+          </w:tcPr>
+          <w:p>
+            <w:r>
+              <w:t>依付款時生效的版本與倍率提供額度，可跨裝置查看。</w:t>
+            </w:r>
+          </w:p>
+        </w:tc>
+      </w:tr>
+      <w:tr>
+        <w:tc>
+          <w:tcPr>
+            <w:tcW w:type="dxa" w:w="3324"/>
+            <w:vAlign w:val="center"/>
+          </w:tcPr>
+          <w:p>
+            <w:r>
+              <w:t>本機 Plus</w:t>
+            </w:r>
+          </w:p>
+        </w:tc>
+        <w:tc>
+          <w:tcPr>
+            <w:tcW w:type="dxa" w:w="3324"/>
+            <w:vAlign w:val="center"/>
+          </w:tcPr>
+          <w:p>
+            <w:r>
+              <w:t>目前裝置</w:t>
+            </w:r>
+          </w:p>
+        </w:tc>
+        <w:tc>
+          <w:tcPr>
+            <w:tcW w:type="dxa" w:w="3324"/>
+            <w:vAlign w:val="center"/>
+          </w:tcPr>
+          <w:p>
+            <w:r>
+              <w:t>紀錄、圖片與答題紀錄不限量；不會自動出現在其他裝置。</w:t>
+            </w:r>
+          </w:p>
+        </w:tc>
+      </w:tr>
+    </w:tbl>
+    <w:p>
+      <w:pPr>
+        <w:pStyle w:val="Heading2"/>
+      </w:pPr>
+      <w:r>
+        <w:rPr>
+          <w:sz w:val="21"/>
+        </w:rPr>
+        <w:t>14.2 本機模式的遊戲題庫</w:t>
+      </w:r>
+    </w:p>
+    <w:p>
+      <w:r>
+        <w:rPr>
+          <w:sz w:val="21"/>
+        </w:rPr>
+        <w:t>本機模式只使用目前裝置內的個人題庫，不會顯示或讀取管理者題庫。遊戲頁會直接顯示「我的題庫」及本機限制說明。若題目不足，請先在目前裝置新增題目後再開始遊戲。</w:t>
+      </w:r>
+    </w:p>
+    <w:p>
+      <w:r>
+        <w:rPr>
+          <w:sz w:val="21"/>
+        </w:rPr>
+        <w:t>本機答題紀錄只保存在目前裝置，不受雲端免費版 30 天或雲端 Plus 1 年的保留期限影響，資料不限量並永久保留，除非使用者自行刪除網站資料、App 資料或移除應用程式。</w:t>
       </w:r>
     </w:p>
     <w:p>
@@ -758,801 +2738,23 @@
       </w:pPr>
       <w:r>
         <w:rPr>
-          <w:rFonts w:ascii="Aptos" w:hAnsi="Aptos" w:eastAsia="Microsoft JhengHei"/>
+          <w:sz w:val="21"/>
         </w:rPr>
-        <w:t>4.2 雲端 Plus</w:t>
+        <w:t>14.3 月曆載入</w:t>
       </w:r>
     </w:p>
     <w:p>
       <w:r>
         <w:rPr>
-          <w:rFonts w:ascii="Aptos" w:hAnsi="Aptos" w:eastAsia="Microsoft JhengHei"/>
+          <w:sz w:val="21"/>
         </w:rPr>
-        <w:t>基準價格為每季 NT$129；實際價格與額度以付款當時畫面顯示的方案版本為準。</w:t>
-      </w:r>
-    </w:p>
-    <w:p>
-      <w:r>
-        <w:rPr>
-          <w:rFonts w:ascii="Aptos" w:hAnsi="Aptos" w:eastAsia="Microsoft JhengHei"/>
-        </w:rPr>
-        <w:t>基準額度：</w:t>
-      </w:r>
-    </w:p>
-    <w:p>
-      <w:pPr>
-        <w:pStyle w:val="ListBullet"/>
-        <w:spacing w:after="60"/>
-      </w:pPr>
-      <w:r>
-        <w:rPr>
-          <w:rFonts w:ascii="Aptos" w:hAnsi="Aptos" w:eastAsia="Microsoft JhengHei"/>
-        </w:rPr>
-        <w:t>行事曆、記帳明細、積分明細、回憶各 300 筆。</w:t>
-      </w:r>
-    </w:p>
-    <w:p>
-      <w:pPr>
-        <w:pStyle w:val="ListBullet"/>
-        <w:spacing w:after="60"/>
-      </w:pPr>
-      <w:r>
-        <w:rPr>
-          <w:rFonts w:ascii="Aptos" w:hAnsi="Aptos" w:eastAsia="Microsoft JhengHei"/>
-        </w:rPr>
-        <w:t>自建遊戲題目 500 題。</w:t>
-      </w:r>
-    </w:p>
-    <w:p>
-      <w:pPr>
-        <w:pStyle w:val="ListBullet"/>
-        <w:spacing w:after="60"/>
-      </w:pPr>
-      <w:r>
-        <w:rPr>
-          <w:rFonts w:ascii="Aptos" w:hAnsi="Aptos" w:eastAsia="Microsoft JhengHei"/>
-        </w:rPr>
-        <w:t>行事曆分享最多 5 人。</w:t>
-      </w:r>
-    </w:p>
-    <w:p>
-      <w:pPr>
-        <w:pStyle w:val="ListBullet"/>
-        <w:spacing w:after="60"/>
-      </w:pPr>
-      <w:r>
-        <w:rPr>
-          <w:rFonts w:ascii="Aptos" w:hAnsi="Aptos" w:eastAsia="Microsoft JhengHei"/>
-        </w:rPr>
-        <w:t>回憶與活動圖片合計 300 MB。</w:t>
-      </w:r>
-    </w:p>
-    <w:p>
-      <w:pPr>
-        <w:pStyle w:val="ListBullet"/>
-        <w:spacing w:after="60"/>
-      </w:pPr>
-      <w:r>
-        <w:rPr>
-          <w:rFonts w:ascii="Aptos" w:hAnsi="Aptos" w:eastAsia="Microsoft JhengHei"/>
-        </w:rPr>
-        <w:t>雲端詳細答題紀錄保留最近 1 年。</w:t>
-      </w:r>
-    </w:p>
-    <w:p>
-      <w:r>
-        <w:rPr>
-          <w:rFonts w:ascii="Aptos" w:hAnsi="Aptos" w:eastAsia="Microsoft JhengHei"/>
-        </w:rPr>
-        <w:t>支付方案倍數時，對應筆數及圖片容量會依倍率增加。舊版權益尚未到期又購買新版加購時，兩份權益會分開顯示，額度在有效期間內相加，不會以新版覆蓋舊版。</w:t>
-      </w:r>
-    </w:p>
-    <w:p>
-      <w:pPr>
-        <w:pStyle w:val="Heading2"/>
-      </w:pPr>
-      <w:r>
-        <w:rPr>
-          <w:rFonts w:ascii="Aptos" w:hAnsi="Aptos" w:eastAsia="Microsoft JhengHei"/>
-        </w:rPr>
-        <w:t>4.3 此裝置 Plus</w:t>
-      </w:r>
-    </w:p>
-    <w:p>
-      <w:pPr>
-        <w:pStyle w:val="ListBullet"/>
-        <w:spacing w:after="60"/>
-      </w:pPr>
-      <w:r>
-        <w:rPr>
-          <w:rFonts w:ascii="Aptos" w:hAnsi="Aptos" w:eastAsia="Microsoft JhengHei"/>
-        </w:rPr>
-        <w:t>基準價格為每季 NT$129。</w:t>
-      </w:r>
-    </w:p>
-    <w:p>
-      <w:pPr>
-        <w:pStyle w:val="ListBullet"/>
-        <w:spacing w:after="60"/>
-      </w:pPr>
-      <w:r>
-        <w:rPr>
-          <w:rFonts w:ascii="Aptos" w:hAnsi="Aptos" w:eastAsia="Microsoft JhengHei"/>
-        </w:rPr>
-        <w:t>此裝置資料不限量。</w:t>
-      </w:r>
-    </w:p>
-    <w:p>
-      <w:pPr>
-        <w:pStyle w:val="ListBullet"/>
-        <w:spacing w:after="60"/>
-      </w:pPr>
-      <w:r>
-        <w:rPr>
-          <w:rFonts w:ascii="Aptos" w:hAnsi="Aptos" w:eastAsia="Microsoft JhengHei"/>
-        </w:rPr>
-        <w:t>資料只存在付款者選擇的裝置或瀏覽器，不會自動跨裝置同步。</w:t>
-      </w:r>
-    </w:p>
-    <w:p>
-      <w:r>
-        <w:rPr>
-          <w:rFonts w:ascii="Aptos" w:hAnsi="Aptos" w:eastAsia="Microsoft JhengHei"/>
-        </w:rPr>
-        <w:t>目前 App 內正式付款流程仍在準備中；上線後以 App 內顯示的付款方式與收據狀態為準。</w:t>
-      </w:r>
-    </w:p>
-    <w:p>
-      <w:pPr>
-        <w:pStyle w:val="Heading2"/>
-      </w:pPr>
-      <w:r>
-        <w:rPr>
-          <w:rFonts w:ascii="Aptos" w:hAnsi="Aptos" w:eastAsia="Microsoft JhengHei"/>
-        </w:rPr>
-        <w:t>4.4 到期與付款失敗</w:t>
-      </w:r>
-    </w:p>
-    <w:p>
-      <w:pPr>
-        <w:pStyle w:val="ListBullet"/>
-        <w:spacing w:after="60"/>
-      </w:pPr>
-      <w:r>
-        <w:rPr>
-          <w:rFonts w:ascii="Aptos" w:hAnsi="Aptos" w:eastAsia="Microsoft JhengHei"/>
-        </w:rPr>
-        <w:t>取消續訂後，權益可使用到已付款期間結束。</w:t>
-      </w:r>
-    </w:p>
-    <w:p>
-      <w:pPr>
-        <w:pStyle w:val="ListBullet"/>
-        <w:spacing w:after="60"/>
-      </w:pPr>
-      <w:r>
-        <w:rPr>
-          <w:rFonts w:ascii="Aptos" w:hAnsi="Aptos" w:eastAsia="Microsoft JhengHei"/>
-        </w:rPr>
-        <w:t>Plus 到期或付款失敗且未續訂時，雲端資料進入唯讀：可查看、匯出或搬到此裝置，但不能新增雲端資料。</w:t>
-      </w:r>
-    </w:p>
-    <w:p>
-      <w:pPr>
-        <w:pStyle w:val="ListBullet"/>
-        <w:spacing w:after="60"/>
-      </w:pPr>
-      <w:r>
-        <w:rPr>
-          <w:rFonts w:ascii="Aptos" w:hAnsi="Aptos" w:eastAsia="Microsoft JhengHei"/>
-        </w:rPr>
-        <w:t>若資料仍在免費額度內，不需要搬移即可繼續使用免費雲端模式。</w:t>
-      </w:r>
-    </w:p>
-    <w:p>
-      <w:pPr>
-        <w:pStyle w:val="ListBullet"/>
-        <w:spacing w:after="60"/>
-      </w:pPr>
-      <w:r>
-        <w:rPr>
-          <w:rFonts w:ascii="Aptos" w:hAnsi="Aptos" w:eastAsia="Microsoft JhengHei"/>
-        </w:rPr>
-        <w:t>若超過免費額度，系統會提示續訂或在 30 天內安全搬移；逾期只刪除超額部分，優先保留最新資料及「保留項」。</w:t>
-      </w:r>
-    </w:p>
-    <w:p>
-      <w:pPr>
-        <w:pStyle w:val="ListBullet"/>
-        <w:spacing w:after="60"/>
-      </w:pPr>
-      <w:r>
-        <w:rPr>
-          <w:rFonts w:ascii="Aptos" w:hAnsi="Aptos" w:eastAsia="Microsoft JhengHei"/>
-        </w:rPr>
-        <w:t>本機資料不受雲端訂閱到期影響。</w:t>
-      </w:r>
-    </w:p>
-    <w:p>
-      <w:pPr>
-        <w:pStyle w:val="Heading1"/>
-      </w:pPr>
-      <w:r>
-        <w:rPr>
-          <w:rFonts w:ascii="Aptos" w:hAnsi="Aptos" w:eastAsia="Microsoft JhengHei"/>
-        </w:rPr>
-        <w:t>5. 首頁</w:t>
-      </w:r>
-    </w:p>
-    <w:p>
-      <w:pPr>
-        <w:pStyle w:val="ListBullet"/>
-        <w:spacing w:after="60"/>
-      </w:pPr>
-      <w:r>
-        <w:rPr>
-          <w:rFonts w:ascii="Aptos" w:hAnsi="Aptos" w:eastAsia="Microsoft JhengHei"/>
-        </w:rPr>
-        <w:t>行程：顯示近期行程，可完成行程或進入行事曆查看。</w:t>
-      </w:r>
-    </w:p>
-    <w:p>
-      <w:pPr>
-        <w:pStyle w:val="ListBullet"/>
-        <w:spacing w:after="60"/>
-      </w:pPr>
-      <w:r>
-        <w:rPr>
-          <w:rFonts w:ascii="Aptos" w:hAnsi="Aptos" w:eastAsia="Microsoft JhengHei"/>
-        </w:rPr>
-        <w:t>記帳／積分：先選擇帳戶，再顯示今日與總計；個人帳戶全部顯示，旅程／團體帳戶顯示最近使用的項目。</w:t>
-      </w:r>
-    </w:p>
-    <w:p>
-      <w:pPr>
-        <w:pStyle w:val="ListBullet"/>
-        <w:spacing w:after="60"/>
-      </w:pPr>
-      <w:r>
-        <w:rPr>
-          <w:rFonts w:ascii="Aptos" w:hAnsi="Aptos" w:eastAsia="Microsoft JhengHei"/>
-        </w:rPr>
-        <w:t>推薦內容：可開啟活動或景點，加入自己的行事曆。</w:t>
-      </w:r>
-    </w:p>
-    <w:p>
-      <w:pPr>
-        <w:pStyle w:val="ListBullet"/>
-        <w:spacing w:after="60"/>
-      </w:pPr>
-      <w:r>
-        <w:rPr>
-          <w:rFonts w:ascii="Aptos" w:hAnsi="Aptos" w:eastAsia="Microsoft JhengHei"/>
-        </w:rPr>
-        <w:t>若切換帳戶後資料未更新，可重新載入首頁；若持續失敗，請確認目前資料模式及網路。</w:t>
-      </w:r>
-    </w:p>
-    <w:p>
-      <w:pPr>
-        <w:pStyle w:val="Heading1"/>
-      </w:pPr>
-      <w:r>
-        <w:rPr>
-          <w:rFonts w:ascii="Aptos" w:hAnsi="Aptos" w:eastAsia="Microsoft JhengHei"/>
-        </w:rPr>
-        <w:t>6. 行事曆與分享</w:t>
-      </w:r>
-    </w:p>
-    <w:p>
-      <w:pPr>
-        <w:pStyle w:val="Heading2"/>
-      </w:pPr>
-      <w:r>
-        <w:rPr>
-          <w:rFonts w:ascii="Aptos" w:hAnsi="Aptos" w:eastAsia="Microsoft JhengHei"/>
-        </w:rPr>
-        <w:t>6.1 建立與編輯</w:t>
-      </w:r>
-    </w:p>
-    <w:p>
-      <w:r>
-        <w:rPr>
-          <w:rFonts w:ascii="Aptos" w:hAnsi="Aptos" w:eastAsia="Microsoft JhengHei"/>
-        </w:rPr>
-        <w:t>點選日期或新增按鈕，輸入名稱、日期、時間、地點、國家、提醒與重複方式。國家使用標準國碼保存，以利地圖及天氣查詢。</w:t>
-      </w:r>
-    </w:p>
-    <w:p>
-      <w:pPr>
-        <w:pStyle w:val="Heading2"/>
-      </w:pPr>
-      <w:r>
-        <w:rPr>
-          <w:rFonts w:ascii="Aptos" w:hAnsi="Aptos" w:eastAsia="Microsoft JhengHei"/>
-        </w:rPr>
-        <w:t>6.2 分享</w:t>
-      </w:r>
-    </w:p>
-    <w:p>
-      <w:pPr>
-        <w:pStyle w:val="ListNumber"/>
-        <w:spacing w:after="60"/>
-      </w:pPr>
-      <w:r>
-        <w:rPr>
-          <w:rFonts w:ascii="Aptos" w:hAnsi="Aptos" w:eastAsia="Microsoft JhengHei"/>
-        </w:rPr>
-        <w:t>開啟行事曆分享。</w:t>
-      </w:r>
-    </w:p>
-    <w:p>
-      <w:pPr>
-        <w:pStyle w:val="ListNumber"/>
-        <w:spacing w:after="60"/>
-      </w:pPr>
-      <w:r>
-        <w:rPr>
-          <w:rFonts w:ascii="Aptos" w:hAnsi="Aptos" w:eastAsia="Microsoft JhengHei"/>
-        </w:rPr>
-        <w:t>輸入受邀者的註冊 Email。</w:t>
-      </w:r>
-    </w:p>
-    <w:p>
-      <w:pPr>
-        <w:pStyle w:val="ListNumber"/>
-        <w:spacing w:after="60"/>
-      </w:pPr>
-      <w:r>
-        <w:rPr>
-          <w:rFonts w:ascii="Aptos" w:hAnsi="Aptos" w:eastAsia="Microsoft JhengHei"/>
-        </w:rPr>
-        <w:t>選擇分享全部事件或目前月份內的指定未到期事件。</w:t>
-      </w:r>
-    </w:p>
-    <w:p>
-      <w:pPr>
-        <w:pStyle w:val="ListNumber"/>
-        <w:spacing w:after="60"/>
-      </w:pPr>
-      <w:r>
-        <w:rPr>
-          <w:rFonts w:ascii="Aptos" w:hAnsi="Aptos" w:eastAsia="Microsoft JhengHei"/>
-        </w:rPr>
-        <w:t>對方接受後，可在自己的行事曆唯讀查看，且會以不同顏色區分擁有者。</w:t>
-      </w:r>
-    </w:p>
-    <w:p>
-      <w:pPr>
-        <w:pStyle w:val="ListNumber"/>
-        <w:spacing w:after="60"/>
-      </w:pPr>
-      <w:r>
-        <w:rPr>
-          <w:rFonts w:ascii="Aptos" w:hAnsi="Aptos" w:eastAsia="Microsoft JhengHei"/>
-        </w:rPr>
-        <w:t>分享者可個別取消某些事件或全部停止分享；受邀者也可停止查看。</w:t>
-      </w:r>
-    </w:p>
-    <w:p>
-      <w:r>
-        <w:rPr>
-          <w:rFonts w:ascii="Aptos" w:hAnsi="Aptos" w:eastAsia="Microsoft JhengHei"/>
-        </w:rPr>
-        <w:t>分享不授予編輯或刪除他人事件的權限。</w:t>
-      </w:r>
-    </w:p>
-    <w:p>
-      <w:pPr>
-        <w:pStyle w:val="Heading1"/>
-      </w:pPr>
-      <w:r>
-        <w:rPr>
-          <w:rFonts w:ascii="Aptos" w:hAnsi="Aptos" w:eastAsia="Microsoft JhengHei"/>
-        </w:rPr>
-        <w:t>7. 記帳與積分</w:t>
-      </w:r>
-    </w:p>
-    <w:p>
-      <w:pPr>
-        <w:pStyle w:val="ListBullet"/>
-        <w:spacing w:after="60"/>
-      </w:pPr>
-      <w:r>
-        <w:rPr>
-          <w:rFonts w:ascii="Aptos" w:hAnsi="Aptos" w:eastAsia="Microsoft JhengHei"/>
-        </w:rPr>
-        <w:t>一級分類：記帳使用食、衣、住、行、育、樂、未分類及保留項；積分使用德、智、體、群、美、未分類及保留項。</w:t>
-      </w:r>
-    </w:p>
-    <w:p>
-      <w:pPr>
-        <w:pStyle w:val="ListBullet"/>
-        <w:spacing w:after="60"/>
-      </w:pPr>
-      <w:r>
-        <w:rPr>
-          <w:rFonts w:ascii="Aptos" w:hAnsi="Aptos" w:eastAsia="Microsoft JhengHei"/>
-        </w:rPr>
-        <w:t>二級分類可自行輸入，主清單不顯示，編輯時可查看及修改。</w:t>
-      </w:r>
-    </w:p>
-    <w:p>
-      <w:pPr>
-        <w:pStyle w:val="ListBullet"/>
-        <w:spacing w:after="60"/>
-      </w:pPr>
-      <w:r>
-        <w:rPr>
-          <w:rFonts w:ascii="Aptos" w:hAnsi="Aptos" w:eastAsia="Microsoft JhengHei"/>
-        </w:rPr>
-        <w:t>日期、金額／積分、幣別（記帳）、說明與分類皆可編輯。</w:t>
-      </w:r>
-    </w:p>
-    <w:p>
-      <w:pPr>
-        <w:pStyle w:val="ListBullet"/>
-        <w:spacing w:after="60"/>
-      </w:pPr>
-      <w:r>
-        <w:rPr>
-          <w:rFonts w:ascii="Aptos" w:hAnsi="Aptos" w:eastAsia="Microsoft JhengHei"/>
-        </w:rPr>
-        <w:t>刪除明細會同步影響今日小計與總計。</w:t>
-      </w:r>
-    </w:p>
-    <w:p>
-      <w:pPr>
-        <w:pStyle w:val="ListBullet"/>
-        <w:spacing w:after="60"/>
-      </w:pPr>
-      <w:r>
-        <w:rPr>
-          <w:rFonts w:ascii="Aptos" w:hAnsi="Aptos" w:eastAsia="Microsoft JhengHei"/>
-        </w:rPr>
-        <w:t>「保留項」不受一般日期範圍限制，查詢時會持續保留顯示。</w:t>
-      </w:r>
-    </w:p>
-    <w:p>
-      <w:pPr>
-        <w:pStyle w:val="ListBullet"/>
-        <w:spacing w:after="60"/>
-      </w:pPr>
-      <w:r>
-        <w:rPr>
-          <w:rFonts w:ascii="Aptos" w:hAnsi="Aptos" w:eastAsia="Microsoft JhengHei"/>
-        </w:rPr>
-        <w:t>一般紀錄先載入最近 30 天；沒有近期資料時顯示最新一筆，可使用「載入更多」繼續向前查詢。</w:t>
-      </w:r>
-    </w:p>
-    <w:p>
-      <w:pPr>
-        <w:pStyle w:val="Heading1"/>
-      </w:pPr>
-      <w:r>
-        <w:rPr>
-          <w:rFonts w:ascii="Aptos" w:hAnsi="Aptos" w:eastAsia="Microsoft JhengHei"/>
-        </w:rPr>
-        <w:t>8. 推薦活動、景點與回憶走廊</w:t>
-      </w:r>
-    </w:p>
-    <w:p>
-      <w:pPr>
-        <w:pStyle w:val="ListBullet"/>
-        <w:spacing w:after="60"/>
-      </w:pPr>
-      <w:r>
-        <w:rPr>
-          <w:rFonts w:ascii="Aptos" w:hAnsi="Aptos" w:eastAsia="Microsoft JhengHei"/>
-        </w:rPr>
-        <w:t>清單模式可依城市及關鍵字篩選。</w:t>
-      </w:r>
-    </w:p>
-    <w:p>
-      <w:pPr>
-        <w:pStyle w:val="ListBullet"/>
-        <w:spacing w:after="60"/>
-      </w:pPr>
-      <w:r>
-        <w:rPr>
-          <w:rFonts w:ascii="Aptos" w:hAnsi="Aptos" w:eastAsia="Microsoft JhengHei"/>
-        </w:rPr>
-        <w:t>地圖模式顯示各縣市數量；點城市名稱或數字後切回該城市清單。</w:t>
-      </w:r>
-    </w:p>
-    <w:p>
-      <w:pPr>
-        <w:pStyle w:val="ListBullet"/>
-        <w:spacing w:after="60"/>
-      </w:pPr>
-      <w:r>
-        <w:rPr>
-          <w:rFonts w:ascii="Aptos" w:hAnsi="Aptos" w:eastAsia="Microsoft JhengHei"/>
-        </w:rPr>
-        <w:t>活動排序先依喜歡／一般／不喜歡，再依有效日期由近到遠。</w:t>
-      </w:r>
-    </w:p>
-    <w:p>
-      <w:pPr>
-        <w:pStyle w:val="ListBullet"/>
-        <w:spacing w:after="60"/>
-      </w:pPr>
-      <w:r>
-        <w:rPr>
-          <w:rFonts w:ascii="Aptos" w:hAnsi="Aptos" w:eastAsia="Microsoft JhengHei"/>
-        </w:rPr>
-        <w:t>景點依城市、地點及名稱排序，並顯示營業時間。</w:t>
-      </w:r>
-    </w:p>
-    <w:p>
-      <w:pPr>
-        <w:pStyle w:val="ListBullet"/>
-        <w:spacing w:after="60"/>
-      </w:pPr>
-      <w:r>
-        <w:rPr>
-          <w:rFonts w:ascii="Aptos" w:hAnsi="Aptos" w:eastAsia="Microsoft JhengHei"/>
-        </w:rPr>
-        <w:t>有照片才顯示圖片區域，沒有照片不保留空白。</w:t>
-      </w:r>
-    </w:p>
-    <w:p>
-      <w:pPr>
-        <w:pStyle w:val="ListBullet"/>
-        <w:spacing w:after="60"/>
-      </w:pPr>
-      <w:r>
-        <w:rPr>
-          <w:rFonts w:ascii="Aptos" w:hAnsi="Aptos" w:eastAsia="Microsoft JhengHei"/>
-        </w:rPr>
-        <w:t>只有存在細項資料時，點卡片才開啟預覽。</w:t>
-      </w:r>
-    </w:p>
-    <w:p>
-      <w:pPr>
-        <w:pStyle w:val="ListBullet"/>
-        <w:spacing w:after="60"/>
-      </w:pPr>
-      <w:r>
-        <w:rPr>
-          <w:rFonts w:ascii="Aptos" w:hAnsi="Aptos" w:eastAsia="Microsoft JhengHei"/>
-        </w:rPr>
-        <w:t>回憶預設顯示最近 30 天，每次「載入更多」再向前 30 天；未來日期的回憶也會顯示。</w:t>
-      </w:r>
-    </w:p>
-    <w:p>
-      <w:r>
-        <w:rPr>
-          <w:rFonts w:ascii="Aptos" w:hAnsi="Aptos" w:eastAsia="Microsoft JhengHei"/>
-        </w:rPr>
-        <w:t>推薦活動的「更新」只在允許的平台、尚未於今日更新且沒有其他更新程序執行時出現。</w:t>
-      </w:r>
-    </w:p>
-    <w:p>
-      <w:pPr>
-        <w:pStyle w:val="Heading1"/>
-      </w:pPr>
-      <w:r>
-        <w:rPr>
-          <w:rFonts w:ascii="Aptos" w:hAnsi="Aptos" w:eastAsia="Microsoft JhengHei"/>
-        </w:rPr>
-        <w:t>9. 遊戲與自建題庫</w:t>
-      </w:r>
-    </w:p>
-    <w:p>
-      <w:pPr>
-        <w:pStyle w:val="ListBullet"/>
-        <w:spacing w:after="60"/>
-      </w:pPr>
-      <w:r>
-        <w:rPr>
-          <w:rFonts w:ascii="Aptos" w:hAnsi="Aptos" w:eastAsia="Microsoft JhengHei"/>
-        </w:rPr>
-        <w:t>一般使用者可選擇管理者題庫或自己的題庫。</w:t>
-      </w:r>
-    </w:p>
-    <w:p>
-      <w:pPr>
-        <w:pStyle w:val="ListBullet"/>
-        <w:spacing w:after="60"/>
-      </w:pPr>
-      <w:r>
-        <w:rPr>
-          <w:rFonts w:ascii="Aptos" w:hAnsi="Aptos" w:eastAsia="Microsoft JhengHei"/>
-        </w:rPr>
-        <w:t>尚未選擇自己的題庫時，不顯示新增及管理按鈕。</w:t>
-      </w:r>
-    </w:p>
-    <w:p>
-      <w:pPr>
-        <w:pStyle w:val="ListBullet"/>
-        <w:spacing w:after="60"/>
-      </w:pPr>
-      <w:r>
-        <w:rPr>
-          <w:rFonts w:ascii="Aptos" w:hAnsi="Aptos" w:eastAsia="Microsoft JhengHei"/>
-        </w:rPr>
-        <w:t>新增與編輯頁會依分類提供完整句子的範例提示。</w:t>
-      </w:r>
-    </w:p>
-    <w:p>
-      <w:pPr>
-        <w:pStyle w:val="ListBullet"/>
-        <w:spacing w:after="60"/>
-      </w:pPr>
-      <w:r>
-        <w:rPr>
-          <w:rFonts w:ascii="Aptos" w:hAnsi="Aptos" w:eastAsia="Microsoft JhengHei"/>
-        </w:rPr>
-        <w:t>系統會檢查同一題庫來源內的重複題目。</w:t>
-      </w:r>
-    </w:p>
-    <w:p>
-      <w:pPr>
-        <w:pStyle w:val="ListBullet"/>
-        <w:spacing w:after="60"/>
-      </w:pPr>
-      <w:r>
-        <w:rPr>
-          <w:rFonts w:ascii="Aptos" w:hAnsi="Aptos" w:eastAsia="Microsoft JhengHei"/>
-        </w:rPr>
-        <w:t>題目可啟用、停用、編輯或刪除；已有答題紀錄而不能直接刪除時，畫面會說明原因。</w:t>
-      </w:r>
-    </w:p>
-    <w:p>
-      <w:pPr>
-        <w:pStyle w:val="ListBullet"/>
-        <w:spacing w:after="60"/>
-      </w:pPr>
-      <w:r>
-        <w:rPr>
-          <w:rFonts w:ascii="Aptos" w:hAnsi="Aptos" w:eastAsia="Microsoft JhengHei"/>
-        </w:rPr>
-        <w:t>遊戲進行中按返回或使用返回手勢時會再次確認，避免手機誤觸離開。</w:t>
-      </w:r>
-    </w:p>
-    <w:p>
-      <w:pPr>
-        <w:pStyle w:val="ListBullet"/>
-        <w:spacing w:after="60"/>
-      </w:pPr>
-      <w:r>
-        <w:rPr>
-          <w:rFonts w:ascii="Aptos" w:hAnsi="Aptos" w:eastAsia="Microsoft JhengHei"/>
-        </w:rPr>
-        <w:t>本機答題紀錄永久保留且不限量；雲端紀錄依方案保留 30 天或 1 年。</w:t>
-      </w:r>
-    </w:p>
-    <w:p>
-      <w:pPr>
-        <w:pStyle w:val="Heading1"/>
-      </w:pPr>
-      <w:r>
-        <w:rPr>
-          <w:rFonts w:ascii="Aptos" w:hAnsi="Aptos" w:eastAsia="Microsoft JhengHei"/>
-        </w:rPr>
-        <w:t>10. 常見問題</w:t>
-      </w:r>
-    </w:p>
-    <w:p>
-      <w:pPr>
-        <w:pStyle w:val="Heading2"/>
-      </w:pPr>
-      <w:r>
-        <w:rPr>
-          <w:rFonts w:ascii="Aptos" w:hAnsi="Aptos" w:eastAsia="Microsoft JhengHei"/>
-        </w:rPr>
-        <w:t>本機資料在另一台裝置看不到</w:t>
-      </w:r>
-    </w:p>
-    <w:p>
-      <w:r>
-        <w:rPr>
-          <w:rFonts w:ascii="Aptos" w:hAnsi="Aptos" w:eastAsia="Microsoft JhengHei"/>
-        </w:rPr>
-        <w:t>這是正常現象。此裝置模式沒有跨裝置同步，請使用同一裝置及同一瀏覽器，或透過資料搬移／匯出功能處理。</w:t>
-      </w:r>
-    </w:p>
-    <w:p>
-      <w:pPr>
-        <w:pStyle w:val="Heading2"/>
-      </w:pPr>
-      <w:r>
-        <w:rPr>
-          <w:rFonts w:ascii="Aptos" w:hAnsi="Aptos" w:eastAsia="Microsoft JhengHei"/>
-        </w:rPr>
-        <w:t>額度已滿</w:t>
-      </w:r>
-    </w:p>
-    <w:p>
-      <w:r>
-        <w:rPr>
-          <w:rFonts w:ascii="Aptos" w:hAnsi="Aptos" w:eastAsia="Microsoft JhengHei"/>
-        </w:rPr>
-        <w:t>刪除不需要的舊資料、訂閱／加購 Plus，或將全部雲端資料搬到此裝置。系統不會在超額時只寫入部分資料。</w:t>
-      </w:r>
-    </w:p>
-    <w:p>
-      <w:pPr>
-        <w:pStyle w:val="Heading2"/>
-      </w:pPr>
-      <w:r>
-        <w:rPr>
-          <w:rFonts w:ascii="Aptos" w:hAnsi="Aptos" w:eastAsia="Microsoft JhengHei"/>
-        </w:rPr>
-        <w:t>推薦活動更新成功但沒有新資料</w:t>
-      </w:r>
-    </w:p>
-    <w:p>
-      <w:r>
-        <w:rPr>
-          <w:rFonts w:ascii="Aptos" w:hAnsi="Aptos" w:eastAsia="Microsoft JhengHei"/>
-        </w:rPr>
-        <w:t>可能是來源沒有新活動、資料均已存在或部分來源失敗。新版會記錄來源成功、失敗及候選新增數；所有來源失敗時不會標記今日完成，可再次嘗試。</w:t>
-      </w:r>
-    </w:p>
-    <w:p>
-      <w:pPr>
-        <w:pStyle w:val="Heading2"/>
-      </w:pPr>
-      <w:r>
-        <w:rPr>
-          <w:rFonts w:ascii="Aptos" w:hAnsi="Aptos" w:eastAsia="Microsoft JhengHei"/>
-        </w:rPr>
-        <w:t>如何避免資料遺失</w:t>
-      </w:r>
-    </w:p>
-    <w:p>
-      <w:pPr>
-        <w:pStyle w:val="ListBullet"/>
-        <w:spacing w:after="60"/>
-      </w:pPr>
-      <w:r>
-        <w:rPr>
-          <w:rFonts w:ascii="Aptos" w:hAnsi="Aptos" w:eastAsia="Microsoft JhengHei"/>
-        </w:rPr>
-        <w:t>本機模式定期匯出。</w:t>
-      </w:r>
-    </w:p>
-    <w:p>
-      <w:pPr>
-        <w:pStyle w:val="ListBullet"/>
-        <w:spacing w:after="60"/>
-      </w:pPr>
-      <w:r>
-        <w:rPr>
-          <w:rFonts w:ascii="Aptos" w:hAnsi="Aptos" w:eastAsia="Microsoft JhengHei"/>
-        </w:rPr>
-        <w:t>搬移資料時保持網路及頁面開啟。</w:t>
-      </w:r>
-    </w:p>
-    <w:p>
-      <w:pPr>
-        <w:pStyle w:val="ListBullet"/>
-        <w:spacing w:after="60"/>
-      </w:pPr>
-      <w:r>
-        <w:rPr>
-          <w:rFonts w:ascii="Aptos" w:hAnsi="Aptos" w:eastAsia="Microsoft JhengHei"/>
-        </w:rPr>
-        <w:t>不要在未匯出前清除網站資料或瀏覽器儲存空間。</w:t>
-      </w:r>
-    </w:p>
-    <w:p>
-      <w:pPr>
-        <w:pStyle w:val="ListBullet"/>
-        <w:spacing w:after="60"/>
-      </w:pPr>
-      <w:r>
-        <w:rPr>
-          <w:rFonts w:ascii="Aptos" w:hAnsi="Aptos" w:eastAsia="Microsoft JhengHei"/>
-        </w:rPr>
-        <w:t>留意訂閱期限、免費帳號 inactivity 提醒及額度警告。</w:t>
+        <w:t>進入月曆時，系統會同時載入當月行程與假日。若當天沒有需要展開的週期事件，系統不會再次下載同一月份，因此當月內容應更快出現。</w:t>
       </w:r>
     </w:p>
     <w:sectPr>
       <w:footerReference w:type="default" r:id="rId9"/>
       <w:pgSz w:w="12240" w:h="15840"/>
-      <w:pgMar w:top="1191" w:right="1191" w:bottom="1077" w:left="1191" w:header="720" w:footer="720" w:gutter="0"/>
+      <w:pgMar w:top="1020" w:right="1134" w:bottom="964" w:left="1134" w:header="720" w:footer="720" w:gutter="0"/>
       <w:cols w:space="720"/>
       <w:docGrid w:linePitch="360"/>
     </w:sectPr>
@@ -1568,12 +2770,7 @@
       <w:jc w:val="center"/>
     </w:pPr>
     <w:r>
-      <w:rPr>
-        <w:rFonts w:ascii="Aptos" w:hAnsi="Aptos" w:eastAsia="Microsoft JhengHei"/>
-        <w:color w:val="646464"/>
-        <w:sz w:val="16"/>
-      </w:rPr>
-      <w:t>Life Pilot  使用者指南</w:t>
+      <w:t>Life Pilot｜2026-09-08</w:t>
     </w:r>
   </w:p>
 </w:ftr>
@@ -1942,9 +3139,6 @@
     <w:name w:val="Normal"/>
     <w:qFormat/>
     <w:rsid w:val="00FC693F"/>
-    <w:pPr>
-      <w:spacing w:after="120" w:line="300" w:lineRule="auto"/>
-    </w:pPr>
     <w:rPr>
       <w:rFonts w:ascii="Microsoft JhengHei" w:hAnsi="Microsoft JhengHei" w:eastAsia="Microsoft JhengHei"/>
       <w:sz w:val="21"/>
@@ -2005,15 +3199,15 @@
     <w:pPr>
       <w:keepNext/>
       <w:keepLines/>
-      <w:spacing w:before="280" w:after="140"/>
+      <w:spacing w:before="480" w:after="0"/>
       <w:outlineLvl w:val="0"/>
     </w:pPr>
     <w:rPr>
       <w:rFonts w:asciiTheme="majorHAnsi" w:eastAsiaTheme="majorEastAsia" w:hAnsiTheme="majorHAnsi" w:cstheme="majorBidi" w:ascii="Microsoft JhengHei" w:hAnsi="Microsoft JhengHei" w:eastAsia="Microsoft JhengHei"/>
       <w:b/>
       <w:bCs/>
-      <w:color w:val="000000"/>
-      <w:sz w:val="34"/>
+      <w:color w:val="176B87"/>
+      <w:sz w:val="36"/>
       <w:szCs w:val="28"/>
     </w:rPr>
   </w:style>
@@ -2029,15 +3223,15 @@
     <w:pPr>
       <w:keepNext/>
       <w:keepLines/>
-      <w:spacing w:before="280" w:after="140"/>
+      <w:spacing w:before="200" w:after="0"/>
       <w:outlineLvl w:val="1"/>
     </w:pPr>
     <w:rPr>
       <w:rFonts w:asciiTheme="majorHAnsi" w:eastAsiaTheme="majorEastAsia" w:hAnsiTheme="majorHAnsi" w:cstheme="majorBidi" w:ascii="Microsoft JhengHei" w:hAnsi="Microsoft JhengHei" w:eastAsia="Microsoft JhengHei"/>
       <w:b/>
       <w:bCs/>
-      <w:color w:val="000000"/>
-      <w:sz w:val="27"/>
+      <w:color w:val="2E7D6E"/>
+      <w:sz w:val="28"/>
       <w:szCs w:val="26"/>
     </w:rPr>
   </w:style>
@@ -2053,14 +3247,14 @@
     <w:pPr>
       <w:keepNext/>
       <w:keepLines/>
-      <w:spacing w:before="280" w:after="140"/>
+      <w:spacing w:before="200" w:after="0"/>
       <w:outlineLvl w:val="2"/>
     </w:pPr>
     <w:rPr>
       <w:rFonts w:asciiTheme="majorHAnsi" w:eastAsiaTheme="majorEastAsia" w:hAnsiTheme="majorHAnsi" w:cstheme="majorBidi" w:ascii="Microsoft JhengHei" w:hAnsi="Microsoft JhengHei" w:eastAsia="Microsoft JhengHei"/>
       <w:b/>
       <w:bCs/>
-      <w:color w:val="000000"/>
+      <w:color w:val="5B6573"/>
       <w:sz w:val="23"/>
     </w:rPr>
   </w:style>
@@ -2292,20 +3486,18 @@
     <w:qFormat/>
     <w:rsid w:val="00FC693F"/>
     <w:pPr>
-      <w:keepNext/>
       <w:pBdr>
         <w:bottom w:val="single" w:sz="8" w:space="4" w:color="4F81BD" w:themeColor="accent1"/>
       </w:pBdr>
-      <w:spacing w:after="140" w:line="240" w:lineRule="auto" w:before="0"/>
+      <w:spacing w:after="300" w:line="240" w:lineRule="auto"/>
       <w:contextualSpacing/>
     </w:pPr>
     <w:rPr>
       <w:rFonts w:asciiTheme="majorHAnsi" w:eastAsiaTheme="majorEastAsia" w:hAnsiTheme="majorHAnsi" w:cstheme="majorBidi" w:ascii="Microsoft JhengHei" w:hAnsi="Microsoft JhengHei" w:eastAsia="Microsoft JhengHei"/>
-      <w:b/>
-      <w:color w:val="000000"/>
+      <w:color w:val="17324D"/>
       <w:spacing w:val="5"/>
       <w:kern w:val="28"/>
-      <w:sz w:val="48"/>
+      <w:sz w:val="52"/>
       <w:szCs w:val="52"/>
     </w:rPr>
   </w:style>

</xml_diff>

<commit_message>
Optimize feedback images and calendar sharing lists
</commit_message>
<xml_diff>
--- a/docs/Life_Pilot_使用者操作說明.docx
+++ b/docs/Life_Pilot_使用者操作說明.docx
@@ -2751,6 +2751,143 @@
         <w:t>進入月曆時，系統會同時載入當月行程與假日。若當天沒有需要展開的週期事件，系統不會再次下載同一月份，因此當月內容應更快出現。</w:t>
       </w:r>
     </w:p>
+    <w:p>
+      <w:r>
+        <w:br w:type="page"/>
+      </w:r>
+    </w:p>
+    <w:p>
+      <w:pPr>
+        <w:pStyle w:val="Heading1"/>
+        <w:keepNext/>
+      </w:pPr>
+      <w:r>
+        <w:rPr>
+          <w:rFonts w:ascii="Microsoft JhengHei" w:hAnsi="Microsoft JhengHei" w:eastAsia="Microsoft JhengHei"/>
+          <w:b/>
+          <w:sz w:val="28"/>
+        </w:rPr>
+        <w:t>15 大量圖片與分享紀錄的操作</w:t>
+      </w:r>
+    </w:p>
+    <w:p>
+      <w:pPr>
+        <w:spacing w:after="120" w:line="300" w:lineRule="auto"/>
+      </w:pPr>
+      <w:r>
+        <w:rPr>
+          <w:rFonts w:ascii="Microsoft JhengHei" w:hAnsi="Microsoft JhengHei" w:eastAsia="Microsoft JhengHei"/>
+          <w:sz w:val="22"/>
+        </w:rPr>
+        <w:t>本次調整改善管理者查看多張意見回饋圖片，以及使用者管理大量行事曆分享事件時的操作流暢度。資料內容、權限與取消分享方式不變。</w:t>
+      </w:r>
+    </w:p>
+    <w:p>
+      <w:pPr>
+        <w:pStyle w:val="Heading2"/>
+        <w:keepNext/>
+      </w:pPr>
+      <w:r>
+        <w:rPr>
+          <w:rFonts w:ascii="Microsoft JhengHei" w:hAnsi="Microsoft JhengHei" w:eastAsia="Microsoft JhengHei"/>
+          <w:b/>
+          <w:sz w:val="24"/>
+        </w:rPr>
+        <w:t>15.1 查看意見回饋圖片</w:t>
+      </w:r>
+    </w:p>
+    <w:p>
+      <w:pPr>
+        <w:pStyle w:val="ListBullet"/>
+        <w:spacing w:after="80"/>
+      </w:pPr>
+      <w:r>
+        <w:rPr>
+          <w:rFonts w:ascii="Microsoft JhengHei" w:hAnsi="Microsoft JhengHei" w:eastAsia="Microsoft JhengHei"/>
+          <w:sz w:val="22"/>
+        </w:rPr>
+        <w:t>開啟一筆意見回饋時，只載入目前看得到的縮圖；左右滑動後才載入後續圖片。</w:t>
+      </w:r>
+    </w:p>
+    <w:p>
+      <w:pPr>
+        <w:pStyle w:val="ListBullet"/>
+        <w:spacing w:after="80"/>
+      </w:pPr>
+      <w:r>
+        <w:rPr>
+          <w:rFonts w:ascii="Microsoft JhengHei" w:hAnsi="Microsoft JhengHei" w:eastAsia="Microsoft JhengHei"/>
+          <w:sz w:val="22"/>
+        </w:rPr>
+        <w:t>點選縮圖可開啟原尺寸預覽並縮放；縮圖載入期間會顯示進度，無法解析時顯示損壞圖片圖示。</w:t>
+      </w:r>
+    </w:p>
+    <w:p>
+      <w:pPr>
+        <w:pStyle w:val="ListBullet"/>
+        <w:spacing w:after="80"/>
+      </w:pPr>
+      <w:r>
+        <w:rPr>
+          <w:rFonts w:ascii="Microsoft JhengHei" w:hAnsi="Microsoft JhengHei" w:eastAsia="Microsoft JhengHei"/>
+          <w:sz w:val="22"/>
+        </w:rPr>
+        <w:t>圖片很多時可直接滑動查看，不必等待全部圖片完成解碼。</w:t>
+      </w:r>
+    </w:p>
+    <w:p>
+      <w:pPr>
+        <w:pStyle w:val="Heading2"/>
+        <w:keepNext/>
+      </w:pPr>
+      <w:r>
+        <w:rPr>
+          <w:rFonts w:ascii="Microsoft JhengHei" w:hAnsi="Microsoft JhengHei" w:eastAsia="Microsoft JhengHei"/>
+          <w:b/>
+          <w:sz w:val="24"/>
+        </w:rPr>
+        <w:t>15.2 管理大量已分享事件</w:t>
+      </w:r>
+    </w:p>
+    <w:p>
+      <w:pPr>
+        <w:pStyle w:val="ListBullet"/>
+        <w:spacing w:after="80"/>
+      </w:pPr>
+      <w:r>
+        <w:rPr>
+          <w:rFonts w:ascii="Microsoft JhengHei" w:hAnsi="Microsoft JhengHei" w:eastAsia="Microsoft JhengHei"/>
+          <w:sz w:val="22"/>
+        </w:rPr>
+        <w:t>在行事曆的分享管理中展開收件者，即可查看已分享給該收件者的事件。</w:t>
+      </w:r>
+    </w:p>
+    <w:p>
+      <w:pPr>
+        <w:pStyle w:val="ListBullet"/>
+        <w:spacing w:after="80"/>
+      </w:pPr>
+      <w:r>
+        <w:rPr>
+          <w:rFonts w:ascii="Microsoft JhengHei" w:hAnsi="Microsoft JhengHei" w:eastAsia="Microsoft JhengHei"/>
+          <w:sz w:val="22"/>
+        </w:rPr>
+        <w:t>事件很多時，清單只建立畫面可見項目；在區塊內上下捲動可繼續查看。</w:t>
+      </w:r>
+    </w:p>
+    <w:p>
+      <w:pPr>
+        <w:pStyle w:val="ListBullet"/>
+        <w:spacing w:after="80"/>
+      </w:pPr>
+      <w:r>
+        <w:rPr>
+          <w:rFonts w:ascii="Microsoft JhengHei" w:hAnsi="Microsoft JhengHei" w:eastAsia="Microsoft JhengHei"/>
+          <w:sz w:val="22"/>
+        </w:rPr>
+        <w:t>可取消單一事件分享，或使用全部取消停止該次分享；其他收件者與未取消事件不受影響。</w:t>
+      </w:r>
+    </w:p>
     <w:sectPr>
       <w:footerReference w:type="default" r:id="rId9"/>
       <w:pgSz w:w="12240" w:h="15840"/>

</xml_diff>